<commit_message>
auto: add 02-Knowledge (2), modify 01-Projects (5), modify 02-Knowledge (2)
</commit_message>
<xml_diff>
--- a/02-Knowledge/career-development/interview-project-summaries/04-embedded-fundamentals/RTOS笔记.docx
+++ b/02-Knowledge/career-development/interview-project-summaries/04-embedded-fundamentals/RTOS笔记.docx
@@ -40,28 +40,7 @@
           <w:color w:val="000000"/>
           <w:highlight w:val="yellow"/>
         </w:rPr>
-        <w:t>内核代码量</w:t>
-      </w:r>
-      <w:r>
-        <w:rPr>
-          <w:color w:val="000000"/>
-          <w:highlight w:val="yellow"/>
-        </w:rPr>
-        <w:t>10KB</w:t>
-      </w:r>
-      <w:r>
-        <w:rPr>
-          <w:color w:val="000000"/>
-          <w:highlight w:val="yellow"/>
-        </w:rPr>
-        <w:t>，零任务内存占用</w:t>
-      </w:r>
-      <w:r>
-        <w:rPr>
-          <w:color w:val="000000"/>
-          <w:highlight w:val="yellow"/>
-        </w:rPr>
-        <w:t>40KB</w:t>
+        <w:t>内核</w:t>
       </w:r>
       <w:r>
         <w:rPr>
@@ -69,7 +48,98 @@
           <w:color w:val="000000"/>
           <w:highlight w:val="yellow"/>
         </w:rPr>
-        <w:t>【有待准确数据】</w:t>
+        <w:t>【</w:t>
+      </w:r>
+      <w:r>
+        <w:rPr>
+          <w:rFonts w:hint="eastAsia"/>
+          <w:color w:val="000000"/>
+          <w:highlight w:val="yellow"/>
+        </w:rPr>
+        <w:t>R</w:t>
+      </w:r>
+      <w:r>
+        <w:rPr>
+          <w:color w:val="000000"/>
+          <w:highlight w:val="yellow"/>
+        </w:rPr>
+        <w:t>AM</w:t>
+      </w:r>
+      <w:r>
+        <w:rPr>
+          <w:rFonts w:hint="eastAsia"/>
+          <w:color w:val="000000"/>
+          <w:highlight w:val="yellow"/>
+        </w:rPr>
+        <w:t>平台</w:t>
+      </w:r>
+      <w:r>
+        <w:rPr>
+          <w:rFonts w:hint="eastAsia"/>
+          <w:color w:val="000000"/>
+          <w:highlight w:val="yellow"/>
+        </w:rPr>
+        <w:t xml:space="preserve"> </w:t>
+      </w:r>
+      <w:r>
+        <w:rPr>
+          <w:color w:val="000000"/>
+          <w:highlight w:val="yellow"/>
+        </w:rPr>
+        <w:t xml:space="preserve"> ROM 5KB,   RAM 1.3KB;    DSP </w:t>
+      </w:r>
+      <w:r>
+        <w:rPr>
+          <w:rFonts w:hint="eastAsia"/>
+          <w:color w:val="000000"/>
+          <w:highlight w:val="yellow"/>
+        </w:rPr>
+        <w:t>平台</w:t>
+      </w:r>
+      <w:r>
+        <w:rPr>
+          <w:color w:val="000000"/>
+          <w:highlight w:val="yellow"/>
+        </w:rPr>
+        <w:t xml:space="preserve">ROM </w:t>
+      </w:r>
+      <w:r>
+        <w:rPr>
+          <w:color w:val="000000"/>
+          <w:highlight w:val="yellow"/>
+        </w:rPr>
+        <w:t>10</w:t>
+      </w:r>
+      <w:r>
+        <w:rPr>
+          <w:color w:val="000000"/>
+          <w:highlight w:val="yellow"/>
+        </w:rPr>
+        <w:t xml:space="preserve">KB,   RAM </w:t>
+      </w:r>
+      <w:r>
+        <w:rPr>
+          <w:color w:val="000000"/>
+          <w:highlight w:val="yellow"/>
+        </w:rPr>
+        <w:t>2.5</w:t>
+      </w:r>
+      <w:bookmarkStart w:id="0" w:name="_GoBack"/>
+      <w:bookmarkEnd w:id="0"/>
+      <w:r>
+        <w:rPr>
+          <w:color w:val="000000"/>
+          <w:highlight w:val="yellow"/>
+        </w:rPr>
+        <w:t>KB</w:t>
+      </w:r>
+      <w:r>
+        <w:rPr>
+          <w:rFonts w:hint="eastAsia"/>
+          <w:color w:val="000000"/>
+          <w:highlight w:val="yellow"/>
+        </w:rPr>
+        <w:t>】</w:t>
       </w:r>
       <w:r>
         <w:rPr>
@@ -144,145 +214,158 @@
         <w:rPr>
           <w:color w:val="FF0000"/>
         </w:rPr>
-        <w:t>5K ROM 2K RAM</w:t>
+        <w:t xml:space="preserve">5K ROM </w:t>
       </w:r>
       <w:r>
         <w:rPr>
           <w:rFonts w:hint="eastAsia"/>
           <w:color w:val="FF0000"/>
         </w:rPr>
-        <w:t>；创建</w:t>
+        <w:t>、</w:t>
+      </w:r>
+      <w:r>
+        <w:rPr>
+          <w:color w:val="FF0000"/>
+        </w:rPr>
+        <w:t>2K RAM</w:t>
       </w:r>
       <w:r>
         <w:rPr>
           <w:rFonts w:hint="eastAsia"/>
           <w:color w:val="FF0000"/>
         </w:rPr>
-        <w:t>3</w:t>
-      </w:r>
-      <w:r>
-        <w:rPr>
-          <w:color w:val="FF0000"/>
-        </w:rPr>
-        <w:t>2</w:t>
+        <w:t>；创建</w:t>
       </w:r>
       <w:r>
         <w:rPr>
           <w:rFonts w:hint="eastAsia"/>
           <w:color w:val="FF0000"/>
         </w:rPr>
-        <w:t>任务至少</w:t>
+        <w:t>3</w:t>
+      </w:r>
+      <w:r>
+        <w:rPr>
+          <w:color w:val="FF0000"/>
+        </w:rPr>
+        <w:t>2</w:t>
       </w:r>
       <w:r>
         <w:rPr>
           <w:rFonts w:hint="eastAsia"/>
           <w:color w:val="FF0000"/>
         </w:rPr>
-        <w:t>1</w:t>
-      </w:r>
-      <w:r>
-        <w:rPr>
-          <w:color w:val="FF0000"/>
-        </w:rPr>
-        <w:t>7KB</w:t>
-      </w:r>
-      <w:r>
-        <w:rPr>
-          <w:rFonts w:hint="eastAsia"/>
-        </w:rPr>
-        <w:t>；</w:t>
-      </w:r>
-    </w:p>
-    <w:p>
-      <w:pPr>
-        <w:pStyle w:val="a3"/>
-      </w:pPr>
-    </w:p>
-    <w:p>
-      <w:pPr>
-        <w:pStyle w:val="a3"/>
-      </w:pPr>
-      <w:r>
-        <w:t xml:space="preserve">1. </w:t>
-      </w:r>
-      <w:r>
-        <w:t>只支持优先级调度，任务可抢占。</w:t>
-      </w:r>
-    </w:p>
-    <w:p>
-      <w:pPr>
-        <w:pStyle w:val="a3"/>
-      </w:pPr>
-      <w:r>
-        <w:t xml:space="preserve">2. </w:t>
-      </w:r>
-      <w:r>
-        <w:t>相比市场上主流实时系统</w:t>
-      </w:r>
-      <w:r>
-        <w:t>ucOS</w:t>
-      </w:r>
-      <w:r>
-        <w:t>、</w:t>
-      </w:r>
-      <w:r>
-        <w:t>FreeRTOS</w:t>
-      </w:r>
-      <w:r>
-        <w:t>，</w:t>
-      </w:r>
-      <w:r>
-        <w:t>AcuOS</w:t>
-      </w:r>
-      <w:r>
-        <w:t>占用资源更少，响应性更高，更适合本地化产品需求应用。</w:t>
-      </w:r>
-    </w:p>
-    <w:p>
-      <w:pPr>
-        <w:pStyle w:val="a3"/>
-        <w:rPr>
-          <w:color w:val="FF0000"/>
-        </w:rPr>
-      </w:pPr>
+        <w:t>任务至少</w:t>
+      </w:r>
       <w:r>
         <w:rPr>
           <w:rFonts w:hint="eastAsia"/>
           <w:color w:val="FF0000"/>
         </w:rPr>
-        <w:t>&gt;</w:t>
+        <w:t>1</w:t>
       </w:r>
       <w:r>
         <w:rPr>
           <w:color w:val="FF0000"/>
         </w:rPr>
-        <w:t>&gt;M4</w:t>
-      </w:r>
+        <w:t>7KB</w:t>
+      </w:r>
+      <w:r>
+        <w:rPr>
+          <w:rFonts w:hint="eastAsia"/>
+        </w:rPr>
+        <w:t>；</w:t>
+      </w:r>
+    </w:p>
+    <w:p>
+      <w:pPr>
+        <w:pStyle w:val="a3"/>
+      </w:pPr>
+    </w:p>
+    <w:p>
+      <w:pPr>
+        <w:pStyle w:val="a3"/>
+      </w:pPr>
+      <w:r>
+        <w:t xml:space="preserve">1. </w:t>
+      </w:r>
+      <w:r>
+        <w:t>只支持优先级调度，任务可抢占。</w:t>
+      </w:r>
+    </w:p>
+    <w:p>
+      <w:pPr>
+        <w:pStyle w:val="a3"/>
+      </w:pPr>
+      <w:r>
+        <w:t xml:space="preserve">2. </w:t>
+      </w:r>
+      <w:r>
+        <w:t>相比市场上主流实时系统</w:t>
+      </w:r>
+      <w:r>
+        <w:t>ucOS</w:t>
+      </w:r>
+      <w:r>
+        <w:t>、</w:t>
+      </w:r>
+      <w:r>
+        <w:t>FreeRTOS</w:t>
+      </w:r>
+      <w:r>
+        <w:t>，</w:t>
+      </w:r>
+      <w:r>
+        <w:t>AcuOS</w:t>
+      </w:r>
+      <w:r>
+        <w:t>占用资源更少，响应性更高，更适合本地化产品需求应用。</w:t>
+      </w:r>
+    </w:p>
+    <w:p>
+      <w:pPr>
+        <w:pStyle w:val="a3"/>
+        <w:rPr>
+          <w:color w:val="FF0000"/>
+        </w:rPr>
+      </w:pPr>
       <w:r>
         <w:rPr>
           <w:rFonts w:hint="eastAsia"/>
           <w:color w:val="FF0000"/>
         </w:rPr>
-        <w:t>平台实测实时性</w:t>
+        <w:t>&gt;</w:t>
+      </w:r>
+      <w:r>
+        <w:rPr>
+          <w:color w:val="FF0000"/>
+        </w:rPr>
+        <w:t>&gt;M4</w:t>
       </w:r>
       <w:r>
         <w:rPr>
           <w:rFonts w:hint="eastAsia"/>
           <w:color w:val="FF0000"/>
         </w:rPr>
-        <w:t>3</w:t>
-      </w:r>
-      <w:r>
-        <w:rPr>
-          <w:color w:val="FF0000"/>
-        </w:rPr>
-        <w:t>MS</w:t>
+        <w:t>平台实测实时性</w:t>
       </w:r>
       <w:r>
         <w:rPr>
           <w:rFonts w:hint="eastAsia"/>
           <w:color w:val="FF0000"/>
         </w:rPr>
+        <w:t>3</w:t>
+      </w:r>
+      <w:r>
+        <w:rPr>
+          <w:color w:val="FF0000"/>
+        </w:rPr>
+        <w:t>MS</w:t>
+      </w:r>
+      <w:r>
+        <w:rPr>
+          <w:rFonts w:hint="eastAsia"/>
+          <w:color w:val="FF0000"/>
+        </w:rPr>
         <w:t>；</w:t>
       </w:r>
     </w:p>
@@ -497,7 +580,6 @@
         <w:pStyle w:val="a3"/>
       </w:pPr>
       <w:r>
-        <w:lastRenderedPageBreak/>
         <w:t>2</w:t>
       </w:r>
       <w:r>
@@ -1877,12 +1959,7 @@
     <w:p>
       <w:pPr>
         <w:pStyle w:val="a3"/>
-        <w:rPr>
-          <w:rFonts w:hint="eastAsia"/>
-        </w:rPr>
-      </w:pPr>
-      <w:bookmarkStart w:id="0" w:name="_GoBack"/>
-      <w:bookmarkEnd w:id="0"/>
+      </w:pPr>
     </w:p>
     <w:p>
       <w:pPr>

</xml_diff>

<commit_message>
auto: [7 files] RTOS面试深挖(PendSV/tick)+narrative训练+框架v3.2学习收尾纪律+嵌入式AI面试优化清单 (.md .docx)
</commit_message>
<xml_diff>
--- a/02-Knowledge/career-development/interview-project-summaries/04-embedded-fundamentals/RTOS笔记.docx
+++ b/02-Knowledge/career-development/interview-project-summaries/04-embedded-fundamentals/RTOS笔记.docx
@@ -1,14 +1,16 @@
 
 <file path=word/document.xml><?xml version="1.0" encoding="utf-8"?>
-<w:document xmlns:wpc="http://schemas.microsoft.com/office/word/2010/wordprocessingCanvas" xmlns:cx="http://schemas.microsoft.com/office/drawing/2014/chartex" xmlns:cx1="http://schemas.microsoft.com/office/drawing/2015/9/8/chartex" xmlns:mc="http://schemas.openxmlformats.org/markup-compatibility/2006" xmlns:o="urn:schemas-microsoft-com:office:office" xmlns:r="http://schemas.openxmlformats.org/officeDocument/2006/relationships" xmlns:m="http://schemas.openxmlformats.org/officeDocument/2006/math" xmlns:v="urn:schemas-microsoft-com:vml" xmlns:wp14="http://schemas.microsoft.com/office/word/2010/wordprocessingDrawing" xmlns:wp="http://schemas.openxmlformats.org/drawingml/2006/wordprocessingDrawing" xmlns:w10="urn:schemas-microsoft-com:office:word" xmlns:w="http://schemas.openxmlformats.org/wordprocessingml/2006/main" xmlns:w14="http://schemas.microsoft.com/office/word/2010/wordml" xmlns:w15="http://schemas.microsoft.com/office/word/2012/wordml" xmlns:w16se="http://schemas.microsoft.com/office/word/2015/wordml/symex" xmlns:wpg="http://schemas.microsoft.com/office/word/2010/wordprocessingGroup" xmlns:wpi="http://schemas.microsoft.com/office/word/2010/wordprocessingInk" xmlns:wne="http://schemas.microsoft.com/office/word/2006/wordml" xmlns:wps="http://schemas.microsoft.com/office/word/2010/wordprocessingShape" mc:Ignorable="w14 w15 w16se wp14">
+<w:document xmlns:wpc="http://schemas.microsoft.com/office/word/2010/wordprocessingCanvas" xmlns:cx="http://schemas.microsoft.com/office/drawing/2014/chartex" xmlns:cx1="http://schemas.microsoft.com/office/drawing/2015/9/8/chartex" xmlns:cx2="http://schemas.microsoft.com/office/drawing/2015/10/21/chartex" xmlns:cx3="http://schemas.microsoft.com/office/drawing/2016/5/9/chartex" xmlns:cx4="http://schemas.microsoft.com/office/drawing/2016/5/10/chartex" xmlns:cx5="http://schemas.microsoft.com/office/drawing/2016/5/11/chartex" xmlns:cx6="http://schemas.microsoft.com/office/drawing/2016/5/12/chartex" xmlns:cx7="http://schemas.microsoft.com/office/drawing/2016/5/13/chartex" xmlns:cx8="http://schemas.microsoft.com/office/drawing/2016/5/14/chartex" xmlns:mc="http://schemas.openxmlformats.org/markup-compatibility/2006" xmlns:aink="http://schemas.microsoft.com/office/drawing/2016/ink" xmlns:am3d="http://schemas.microsoft.com/office/drawing/2017/model3d" xmlns:o="urn:schemas-microsoft-com:office:office" xmlns:r="http://schemas.openxmlformats.org/officeDocument/2006/relationships" xmlns:m="http://schemas.openxmlformats.org/officeDocument/2006/math" xmlns:v="urn:schemas-microsoft-com:vml" xmlns:wp14="http://schemas.microsoft.com/office/word/2010/wordprocessingDrawing" xmlns:wp="http://schemas.openxmlformats.org/drawingml/2006/wordprocessingDrawing" xmlns:w10="urn:schemas-microsoft-com:office:word" xmlns:w="http://schemas.openxmlformats.org/wordprocessingml/2006/main" xmlns:w14="http://schemas.microsoft.com/office/word/2010/wordml" xmlns:w15="http://schemas.microsoft.com/office/word/2012/wordml" xmlns:w16cex="http://schemas.microsoft.com/office/word/2018/wordml/cex" xmlns:w16cid="http://schemas.microsoft.com/office/word/2016/wordml/cid" xmlns:w16="http://schemas.microsoft.com/office/word/2018/wordml" xmlns:w16sdtdh="http://schemas.microsoft.com/office/word/2020/wordml/sdtdatahash" xmlns:w16se="http://schemas.microsoft.com/office/word/2015/wordml/symex" xmlns:wpg="http://schemas.microsoft.com/office/word/2010/wordprocessingGroup" xmlns:wpi="http://schemas.microsoft.com/office/word/2010/wordprocessingInk" xmlns:wne="http://schemas.microsoft.com/office/word/2006/wordml" xmlns:wps="http://schemas.microsoft.com/office/word/2010/wordprocessingShape" mc:Ignorable="w14 w15 w16se w16cid w16 w16cex w16sdtdh wp14">
   <w:body>
     <w:p>
       <w:pPr>
         <w:pStyle w:val="3"/>
       </w:pPr>
+      <w:proofErr w:type="spellStart"/>
       <w:r>
         <w:t>AcuOS</w:t>
       </w:r>
+      <w:proofErr w:type="spellEnd"/>
     </w:p>
     <w:p>
       <w:pPr>
@@ -23,15 +25,19 @@
       <w:r>
         <w:t>、相比市场上主流实时系统</w:t>
       </w:r>
+      <w:proofErr w:type="spellStart"/>
       <w:r>
         <w:t>ucOS</w:t>
       </w:r>
+      <w:proofErr w:type="spellEnd"/>
       <w:r>
         <w:t>、</w:t>
       </w:r>
+      <w:proofErr w:type="spellStart"/>
       <w:r>
         <w:t>FreeRTOS</w:t>
       </w:r>
+      <w:proofErr w:type="spellEnd"/>
       <w:r>
         <w:t>占用更少资源，</w:t>
       </w:r>
@@ -101,37 +107,7 @@
           <w:color w:val="000000"/>
           <w:highlight w:val="yellow"/>
         </w:rPr>
-        <w:t xml:space="preserve">ROM </w:t>
-      </w:r>
-      <w:r>
-        <w:rPr>
-          <w:color w:val="000000"/>
-          <w:highlight w:val="yellow"/>
-        </w:rPr>
-        <w:t>10</w:t>
-      </w:r>
-      <w:r>
-        <w:rPr>
-          <w:color w:val="000000"/>
-          <w:highlight w:val="yellow"/>
-        </w:rPr>
-        <w:t xml:space="preserve">KB,   RAM </w:t>
-      </w:r>
-      <w:r>
-        <w:rPr>
-          <w:color w:val="000000"/>
-          <w:highlight w:val="yellow"/>
-        </w:rPr>
-        <w:t>2.5</w:t>
-      </w:r>
-      <w:bookmarkStart w:id="0" w:name="_GoBack"/>
-      <w:bookmarkEnd w:id="0"/>
-      <w:r>
-        <w:rPr>
-          <w:color w:val="000000"/>
-          <w:highlight w:val="yellow"/>
-        </w:rPr>
-        <w:t>KB</w:t>
+        <w:t>ROM 10KB,   RAM 2.5KB</w:t>
       </w:r>
       <w:r>
         <w:rPr>
@@ -189,6 +165,7 @@
         </w:rPr>
         <w:t>注：</w:t>
       </w:r>
+      <w:proofErr w:type="spellStart"/>
       <w:r>
         <w:rPr>
           <w:rFonts w:hint="eastAsia"/>
@@ -196,6 +173,7 @@
         </w:rPr>
         <w:t>FreeRTOS</w:t>
       </w:r>
+      <w:proofErr w:type="spellEnd"/>
       <w:r>
         <w:rPr>
           <w:rFonts w:hint="eastAsia"/>
@@ -302,21 +280,27 @@
       <w:r>
         <w:t>相比市场上主流实时系统</w:t>
       </w:r>
+      <w:proofErr w:type="spellStart"/>
       <w:r>
         <w:t>ucOS</w:t>
       </w:r>
+      <w:proofErr w:type="spellEnd"/>
       <w:r>
         <w:t>、</w:t>
       </w:r>
+      <w:proofErr w:type="spellStart"/>
       <w:r>
         <w:t>FreeRTOS</w:t>
       </w:r>
+      <w:proofErr w:type="spellEnd"/>
       <w:r>
         <w:t>，</w:t>
       </w:r>
+      <w:proofErr w:type="spellStart"/>
       <w:r>
         <w:t>AcuOS</w:t>
       </w:r>
+      <w:proofErr w:type="spellEnd"/>
       <w:r>
         <w:t>占用资源更少，响应性更高，更适合本地化产品需求应用。</w:t>
       </w:r>
@@ -408,12 +392,26 @@
         <w:rPr>
           <w:color w:val="FF0000"/>
         </w:rPr>
-        <w:t>任务栈配置</w:t>
-      </w:r>
+        <w:t>任务</w:t>
+      </w:r>
+      <w:proofErr w:type="gramStart"/>
       <w:r>
         <w:rPr>
           <w:color w:val="FF0000"/>
         </w:rPr>
+        <w:t>栈</w:t>
+      </w:r>
+      <w:proofErr w:type="gramEnd"/>
+      <w:r>
+        <w:rPr>
+          <w:color w:val="FF0000"/>
+        </w:rPr>
+        <w:t>配置</w:t>
+      </w:r>
+      <w:r>
+        <w:rPr>
+          <w:color w:val="FF0000"/>
+        </w:rPr>
         <w:t>(</w:t>
       </w:r>
       <w:r>
@@ -580,6 +578,7 @@
         <w:pStyle w:val="a3"/>
       </w:pPr>
       <w:r>
+        <w:lastRenderedPageBreak/>
         <w:t>2</w:t>
       </w:r>
       <w:r>
@@ -619,8 +618,13 @@
       <w:r>
         <w:t>除了</w:t>
       </w:r>
-      <w:r>
-        <w:t xml:space="preserve">systick  </w:t>
+      <w:proofErr w:type="spellStart"/>
+      <w:r>
+        <w:t>systick</w:t>
+      </w:r>
+      <w:proofErr w:type="spellEnd"/>
+      <w:r>
+        <w:t xml:space="preserve">  </w:t>
       </w:r>
       <w:r>
         <w:t>空闲任务，还有</w:t>
@@ -640,7 +644,15 @@
         <w:t>&gt;&gt;</w:t>
       </w:r>
       <w:r>
-        <w:t>任务一：</w:t>
+        <w:t>任务</w:t>
+      </w:r>
+      <w:proofErr w:type="gramStart"/>
+      <w:r>
+        <w:t>一</w:t>
+      </w:r>
+      <w:proofErr w:type="gramEnd"/>
+      <w:r>
+        <w:t>：</w:t>
       </w:r>
       <w:r>
         <w:t>10MS  20MS</w:t>
@@ -787,9 +799,11 @@
       <w:pPr>
         <w:pStyle w:val="a3"/>
       </w:pPr>
+      <w:proofErr w:type="spellStart"/>
       <w:r>
         <w:t>OsQPend</w:t>
       </w:r>
+      <w:proofErr w:type="spellEnd"/>
       <w:r>
         <w:t>队列：</w:t>
       </w:r>
@@ -810,15 +824,19 @@
       <w:pPr>
         <w:pStyle w:val="a3"/>
       </w:pPr>
+      <w:proofErr w:type="spellStart"/>
       <w:r>
         <w:t>OsFlagPend</w:t>
       </w:r>
+      <w:proofErr w:type="spellEnd"/>
       <w:r>
         <w:t>：按键、</w:t>
       </w:r>
+      <w:proofErr w:type="spellStart"/>
       <w:r>
         <w:t>Modbust</w:t>
       </w:r>
+      <w:proofErr w:type="spellEnd"/>
       <w:r>
         <w:t>通信处理</w:t>
       </w:r>
@@ -827,9 +845,11 @@
       <w:pPr>
         <w:pStyle w:val="a3"/>
       </w:pPr>
+      <w:proofErr w:type="spellStart"/>
       <w:r>
         <w:t>T_OsMutex</w:t>
       </w:r>
+      <w:proofErr w:type="spellEnd"/>
       <w:r>
         <w:t>：</w:t>
       </w:r>
@@ -850,9 +870,11 @@
       <w:pPr>
         <w:pStyle w:val="a3"/>
       </w:pPr>
+      <w:proofErr w:type="spellStart"/>
       <w:r>
         <w:t>T_OsSem</w:t>
       </w:r>
+      <w:proofErr w:type="spellEnd"/>
       <w:r>
         <w:t>信号量：</w:t>
       </w:r>
@@ -883,7 +905,15 @@
         <w:pStyle w:val="a3"/>
       </w:pPr>
       <w:r>
-        <w:t>》》看一下存储源码用了那些？信号量如何使用的？</w:t>
+        <w:t>》</w:t>
+      </w:r>
+      <w:proofErr w:type="gramStart"/>
+      <w:r>
+        <w:t>》</w:t>
+      </w:r>
+      <w:proofErr w:type="gramEnd"/>
+      <w:r>
+        <w:t>看一下存储源码用了那些？信号量如何使用的？</w:t>
       </w:r>
     </w:p>
     <w:p>
@@ -902,6 +932,7 @@
       <w:pPr>
         <w:pStyle w:val="a3"/>
       </w:pPr>
+      <w:proofErr w:type="spellStart"/>
       <w:r>
         <w:rPr>
           <w:b/>
@@ -911,6 +942,7 @@
         <w:lastRenderedPageBreak/>
         <w:t>FreeRTOS</w:t>
       </w:r>
+      <w:proofErr w:type="spellEnd"/>
     </w:p>
     <w:p>
       <w:pPr>
@@ -958,14 +990,24 @@
         <w:t>避免堆栈溢出：使用</w:t>
       </w:r>
       <w:r>
-        <w:t> uxTaskGetStackHighWaterMark()</w:t>
+        <w:t> </w:t>
+      </w:r>
+      <w:proofErr w:type="spellStart"/>
+      <w:r>
+        <w:t>uxTaskGetStackHighWaterMark</w:t>
+      </w:r>
+      <w:proofErr w:type="spellEnd"/>
+      <w:r>
+        <w:t>()</w:t>
       </w:r>
       <w:r>
         <w:t>（</w:t>
       </w:r>
+      <w:proofErr w:type="spellStart"/>
       <w:r>
         <w:t>FreeRTOS</w:t>
       </w:r>
+      <w:proofErr w:type="spellEnd"/>
       <w:r>
         <w:t>）或堆栈检测钩子函数。</w:t>
       </w:r>
@@ -979,7 +1021,15 @@
         </w:numPr>
       </w:pPr>
       <w:r>
-        <w:t>典型需求：任务栈深</w:t>
+        <w:t>典型需求：任务</w:t>
+      </w:r>
+      <w:proofErr w:type="gramStart"/>
+      <w:r>
+        <w:t>栈</w:t>
+      </w:r>
+      <w:proofErr w:type="gramEnd"/>
+      <w:r>
+        <w:t>深</w:t>
       </w:r>
       <w:r>
         <w:t xml:space="preserve"> 512B~4KB</w:t>
@@ -1046,7 +1096,15 @@
         <w:t>（如</w:t>
       </w:r>
       <w:r>
-        <w:t> xSemaphoreCreateMutex()</w:t>
+        <w:t> </w:t>
+      </w:r>
+      <w:proofErr w:type="spellStart"/>
+      <w:r>
+        <w:t>xSemaphoreCreateMutex</w:t>
+      </w:r>
+      <w:proofErr w:type="spellEnd"/>
+      <w:r>
+        <w:t>()</w:t>
       </w:r>
       <w:r>
         <w:t>）替代二值信号量。</w:t>
@@ -1115,8 +1173,13 @@
         <w:pStyle w:val="a3"/>
       </w:pPr>
       <w:r>
-        <w:t>// FreeRTOS</w:t>
-      </w:r>
+        <w:t xml:space="preserve">// </w:t>
+      </w:r>
+      <w:proofErr w:type="spellStart"/>
+      <w:r>
+        <w:t>FreeRTOS</w:t>
+      </w:r>
+      <w:proofErr w:type="spellEnd"/>
       <w:r>
         <w:t>中断中发送通知</w:t>
       </w:r>
@@ -1126,31 +1189,118 @@
         <w:pStyle w:val="a3"/>
       </w:pPr>
       <w:r>
-        <w:t>void IRQ_Handler() {</w:t>
-      </w:r>
-    </w:p>
-    <w:p>
-      <w:pPr>
-        <w:pStyle w:val="a3"/>
-      </w:pPr>
-      <w:r>
-        <w:t xml:space="preserve">  BaseType_t xHigherPriorityTaskWoken = pdFALSE;</w:t>
-      </w:r>
-    </w:p>
-    <w:p>
-      <w:pPr>
-        <w:pStyle w:val="a3"/>
-      </w:pPr>
-      <w:r>
-        <w:t xml:space="preserve">  vTaskNotifyGiveFromISR(xTaskHandle, &amp;xHigherPriorityTaskWoken);</w:t>
-      </w:r>
-    </w:p>
-    <w:p>
-      <w:pPr>
-        <w:pStyle w:val="a3"/>
-      </w:pPr>
-      <w:r>
-        <w:t xml:space="preserve">  portYIELD_FROM_ISR(xHigherPriorityTaskWoken);</w:t>
+        <w:t xml:space="preserve">void </w:t>
+      </w:r>
+      <w:proofErr w:type="spellStart"/>
+      <w:r>
+        <w:t>IRQ_</w:t>
+      </w:r>
+      <w:proofErr w:type="gramStart"/>
+      <w:r>
+        <w:t>Handler</w:t>
+      </w:r>
+      <w:proofErr w:type="spellEnd"/>
+      <w:r>
+        <w:t>(</w:t>
+      </w:r>
+      <w:proofErr w:type="gramEnd"/>
+      <w:r>
+        <w:t>) {</w:t>
+      </w:r>
+    </w:p>
+    <w:p>
+      <w:pPr>
+        <w:pStyle w:val="a3"/>
+      </w:pPr>
+      <w:r>
+        <w:t xml:space="preserve">  </w:t>
+      </w:r>
+      <w:proofErr w:type="spellStart"/>
+      <w:r>
+        <w:t>BaseType_t</w:t>
+      </w:r>
+      <w:proofErr w:type="spellEnd"/>
+      <w:r>
+        <w:t xml:space="preserve"> </w:t>
+      </w:r>
+      <w:proofErr w:type="spellStart"/>
+      <w:r>
+        <w:t>xHigherPriorityTaskWoken</w:t>
+      </w:r>
+      <w:proofErr w:type="spellEnd"/>
+      <w:r>
+        <w:t xml:space="preserve"> = </w:t>
+      </w:r>
+      <w:proofErr w:type="spellStart"/>
+      <w:r>
+        <w:t>pdFALSE</w:t>
+      </w:r>
+      <w:proofErr w:type="spellEnd"/>
+      <w:r>
+        <w:t>;</w:t>
+      </w:r>
+    </w:p>
+    <w:p>
+      <w:pPr>
+        <w:pStyle w:val="a3"/>
+      </w:pPr>
+      <w:r>
+        <w:t xml:space="preserve">  </w:t>
+      </w:r>
+      <w:proofErr w:type="spellStart"/>
+      <w:proofErr w:type="gramStart"/>
+      <w:r>
+        <w:t>vTaskNotifyGiveFromISR</w:t>
+      </w:r>
+      <w:proofErr w:type="spellEnd"/>
+      <w:r>
+        <w:t>(</w:t>
+      </w:r>
+      <w:proofErr w:type="spellStart"/>
+      <w:proofErr w:type="gramEnd"/>
+      <w:r>
+        <w:t>xTaskHandle</w:t>
+      </w:r>
+      <w:proofErr w:type="spellEnd"/>
+      <w:r>
+        <w:t>, &amp;</w:t>
+      </w:r>
+      <w:proofErr w:type="spellStart"/>
+      <w:r>
+        <w:t>xHigherPriorityTaskWoken</w:t>
+      </w:r>
+      <w:proofErr w:type="spellEnd"/>
+      <w:r>
+        <w:t>);</w:t>
+      </w:r>
+    </w:p>
+    <w:p>
+      <w:pPr>
+        <w:pStyle w:val="a3"/>
+      </w:pPr>
+      <w:r>
+        <w:t xml:space="preserve">  </w:t>
+      </w:r>
+      <w:proofErr w:type="spellStart"/>
+      <w:r>
+        <w:t>portYIELD_FROM_</w:t>
+      </w:r>
+      <w:proofErr w:type="gramStart"/>
+      <w:r>
+        <w:t>ISR</w:t>
+      </w:r>
+      <w:proofErr w:type="spellEnd"/>
+      <w:r>
+        <w:t>(</w:t>
+      </w:r>
+      <w:proofErr w:type="spellStart"/>
+      <w:proofErr w:type="gramEnd"/>
+      <w:r>
+        <w:t>xHigherPriorityTaskWoken</w:t>
+      </w:r>
+      <w:proofErr w:type="spellEnd"/>
+      <w:r>
+        <w:t>);</w:t>
       </w:r>
     </w:p>
     <w:p>
@@ -1201,7 +1351,15 @@
         <w:pStyle w:val="a3"/>
       </w:pPr>
       <w:r>
-        <w:t>void vApplicationIdleHook(void) {</w:t>
+        <w:t xml:space="preserve">void </w:t>
+      </w:r>
+      <w:proofErr w:type="spellStart"/>
+      <w:r>
+        <w:t>vApplicationIdleHook</w:t>
+      </w:r>
+      <w:proofErr w:type="spellEnd"/>
+      <w:r>
+        <w:t>(void) {</w:t>
       </w:r>
     </w:p>
     <w:p>
@@ -1413,7 +1571,15 @@
         <w:t>事件组</w:t>
       </w:r>
       <w:r>
-        <w:t>：用于多事件同步，一个任务可以等待多个事件的任意组合。</w:t>
+        <w:t>：用于</w:t>
+      </w:r>
+      <w:proofErr w:type="gramStart"/>
+      <w:r>
+        <w:t>多事件</w:t>
+      </w:r>
+      <w:proofErr w:type="gramEnd"/>
+      <w:r>
+        <w:t>同步，一个任务可以等待多个事件的任意组合。</w:t>
       </w:r>
     </w:p>
     <w:p>
@@ -1430,9 +1596,11 @@
       <w:pPr>
         <w:pStyle w:val="21"/>
       </w:pPr>
+      <w:proofErr w:type="spellStart"/>
       <w:r>
         <w:t>FreeRTOS</w:t>
       </w:r>
+      <w:proofErr w:type="spellEnd"/>
       <w:r>
         <w:t>的任务调度算法是什么？优先级抢占机制的核心是什么？如何保证嵌入式系统的</w:t>
       </w:r>
@@ -1453,9 +1621,11 @@
       <w:r>
         <w:t>核心调度算法：</w:t>
       </w:r>
+      <w:proofErr w:type="spellStart"/>
       <w:r>
         <w:t>FreeRTOS</w:t>
       </w:r>
+      <w:proofErr w:type="spellEnd"/>
       <w:r>
         <w:t>采用</w:t>
       </w:r>
@@ -1469,7 +1639,15 @@
         <w:t>”</w:t>
       </w:r>
       <w:r>
-        <w:t>，同时支持时间片轮转调度（同优先级任务）；高优先级任务就绪时，会立即抢占低优先级任务的</w:t>
+        <w:t>，同时支持时间片轮转调度（同优先级任务）；高优先级任务就绪时，会立即</w:t>
+      </w:r>
+      <w:proofErr w:type="gramStart"/>
+      <w:r>
+        <w:t>抢占低</w:t>
+      </w:r>
+      <w:proofErr w:type="gramEnd"/>
+      <w:r>
+        <w:t>优先级任务的</w:t>
       </w:r>
       <w:r>
         <w:t>CPU</w:t>
@@ -1500,11 +1678,21 @@
       <w:r>
         <w:t>）中存储任务优先级，系统维护一个优先级位图（</w:t>
       </w:r>
+      <w:proofErr w:type="spellStart"/>
       <w:r>
         <w:t>uxTopReadyPriority</w:t>
       </w:r>
-      <w:r>
-        <w:t>），快速定位当前最高优先级的就绪任务；调度器在任务阻塞、中断退出、任务创建</w:t>
+      <w:proofErr w:type="spellEnd"/>
+      <w:r>
+        <w:t>），快速定位当前最高优先级的就绪任务；</w:t>
+      </w:r>
+      <w:proofErr w:type="gramStart"/>
+      <w:r>
+        <w:t>调度器</w:t>
+      </w:r>
+      <w:proofErr w:type="gramEnd"/>
+      <w:r>
+        <w:t>在任务阻塞、中断退出、任务创建</w:t>
       </w:r>
       <w:r>
         <w:t>/</w:t>
@@ -1557,9 +1745,11 @@
       <w:r>
         <w:t>优化中断处理函数，缩短中断执行时间，避免在中断中做耗时操作（如</w:t>
       </w:r>
+      <w:proofErr w:type="spellStart"/>
       <w:r>
         <w:t>printf</w:t>
       </w:r>
+      <w:proofErr w:type="spellEnd"/>
       <w:r>
         <w:t>打印），耗时操作通过信号量交给后台任务处理；</w:t>
       </w:r>
@@ -1575,9 +1765,11 @@
       <w:r>
         <w:t>优化任务切换时间，合理配置</w:t>
       </w:r>
+      <w:proofErr w:type="spellStart"/>
       <w:r>
         <w:t>FreeRTOS</w:t>
       </w:r>
+      <w:proofErr w:type="spellEnd"/>
       <w:r>
         <w:t>的系统时钟节拍（</w:t>
       </w:r>
@@ -1613,9 +1805,11 @@
       <w:pPr>
         <w:pStyle w:val="21"/>
       </w:pPr>
+      <w:proofErr w:type="spellStart"/>
       <w:r>
         <w:t>FreeRTOS</w:t>
       </w:r>
+      <w:proofErr w:type="spellEnd"/>
       <w:r>
         <w:t>中，任务优先级反转是什么？如何解决？请结合工业场景举例。</w:t>
       </w:r>
@@ -1628,7 +1822,15 @@
         <w:t xml:space="preserve">① </w:t>
       </w:r>
       <w:r>
-        <w:t>优先级反转定义：高优先级任务等待低优先级任务释放资源（如信号量、互斥锁），而低优先级任务又被中优先级任务抢占，导致高优先级任务无法及时执行，出现</w:t>
+        <w:t>优先级反转定义：高优先级任务</w:t>
+      </w:r>
+      <w:proofErr w:type="gramStart"/>
+      <w:r>
+        <w:t>等待低</w:t>
+      </w:r>
+      <w:proofErr w:type="gramEnd"/>
+      <w:r>
+        <w:t>优先级任务释放资源（如信号量、互斥锁），而低优先级任务又被中优先级任务抢占，导致高优先级任务无法及时执行，出现</w:t>
       </w:r>
       <w:r>
         <w:t>“</w:t>
@@ -1662,7 +1864,15 @@
         <w:t>3</w:t>
       </w:r>
       <w:r>
-        <w:t>种，重点讲工业场景常用的</w:t>
+        <w:t>种，重点</w:t>
+      </w:r>
+      <w:proofErr w:type="gramStart"/>
+      <w:r>
+        <w:t>讲工业</w:t>
+      </w:r>
+      <w:proofErr w:type="gramEnd"/>
+      <w:r>
+        <w:t>场景常用的</w:t>
       </w:r>
       <w:r>
         <w:t>2</w:t>
@@ -1682,14 +1892,26 @@
       <w:r>
         <w:t>优先级继承机制：当低优先级任务持有高优先级任务需要的互斥锁时，暂时将低优先级任务的优先级提升到与高优先级任务相同，直到低优先级任务释放互斥锁，再恢复其原优先级（</w:t>
       </w:r>
+      <w:proofErr w:type="spellStart"/>
       <w:r>
         <w:t>FreeRTOS</w:t>
       </w:r>
+      <w:proofErr w:type="spellEnd"/>
       <w:r>
         <w:t>的</w:t>
       </w:r>
-      <w:r>
-        <w:t>xSemaphoreCreateMutex()</w:t>
+      <w:proofErr w:type="spellStart"/>
+      <w:proofErr w:type="gramStart"/>
+      <w:r>
+        <w:t>xSemaphoreCreateMutex</w:t>
+      </w:r>
+      <w:proofErr w:type="spellEnd"/>
+      <w:r>
+        <w:t>(</w:t>
+      </w:r>
+      <w:proofErr w:type="gramEnd"/>
+      <w:r>
+        <w:t>)</w:t>
       </w:r>
       <w:r>
         <w:t>创建的互斥锁，默认支持优先级继承）；</w:t>
@@ -1741,7 +1963,15 @@
         <w:t>”</w:t>
       </w:r>
       <w:r>
-        <w:t>需要等待低优先级的</w:t>
+        <w:t>需要</w:t>
+      </w:r>
+      <w:proofErr w:type="gramStart"/>
+      <w:r>
+        <w:t>等待低</w:t>
+      </w:r>
+      <w:proofErr w:type="gramEnd"/>
+      <w:r>
+        <w:t>优先级的</w:t>
       </w:r>
       <w:r>
         <w:t>“</w:t>
@@ -1771,13 +2001,29 @@
         <w:t>”</w:t>
       </w:r>
       <w:r>
-        <w:t>会抢占低优先级任务，导致报警信号延迟处理（最长达</w:t>
+        <w:t>会</w:t>
+      </w:r>
+      <w:proofErr w:type="gramStart"/>
+      <w:r>
+        <w:t>抢占低</w:t>
+      </w:r>
+      <w:proofErr w:type="gramEnd"/>
+      <w:r>
+        <w:t>优先级任务，导致报警信号延迟处理（最长达</w:t>
       </w:r>
       <w:r>
         <w:t>3ms</w:t>
       </w:r>
       <w:r>
-        <w:t>，超出国标要求）。后续采用优先级继承机制，当低优先级任务持有</w:t>
+        <w:t>，超出国标要求）。后续采用优先级继承机制，</w:t>
+      </w:r>
+      <w:proofErr w:type="gramStart"/>
+      <w:r>
+        <w:t>当低优先级</w:t>
+      </w:r>
+      <w:proofErr w:type="gramEnd"/>
+      <w:r>
+        <w:t>任务持有</w:t>
       </w:r>
       <w:r>
         <w:t>Flash</w:t>
@@ -1819,8 +2065,13 @@
       <w:r>
         <w:t>&gt;&gt;</w:t>
       </w:r>
-      <w:r>
-        <w:t>最经典案例是火星探路者号任务失败事件</w:t>
+      <w:proofErr w:type="gramStart"/>
+      <w:r>
+        <w:t>最</w:t>
+      </w:r>
+      <w:proofErr w:type="gramEnd"/>
+      <w:r>
+        <w:t>经典案例是火星探路者号任务失败事件</w:t>
       </w:r>
       <w:r>
         <w:t>——</w:t>
@@ -1971,14 +2222,21 @@
       <w:r>
         <w:t>的</w:t>
       </w:r>
+      <w:proofErr w:type="spellStart"/>
       <w:r>
         <w:t>Systick</w:t>
       </w:r>
+      <w:proofErr w:type="spellEnd"/>
       <w:r>
         <w:t>和</w:t>
       </w:r>
-      <w:r>
-        <w:t xml:space="preserve">Pendsv </w:t>
+      <w:proofErr w:type="spellStart"/>
+      <w:r>
+        <w:t>Pendsv</w:t>
+      </w:r>
+      <w:proofErr w:type="spellEnd"/>
+      <w:r>
+        <w:t xml:space="preserve"> </w:t>
       </w:r>
       <w:r>
         <w:t>中断优先级设计</w:t>
@@ -2030,12 +2288,1186 @@
     <w:p>
       <w:pPr>
         <w:pStyle w:val="a3"/>
-      </w:pPr>
-    </w:p>
-    <w:p>
-      <w:pPr>
-        <w:pStyle w:val="a3"/>
-      </w:pPr>
+        <w:rPr>
+          <w:color w:val="FF0000"/>
+        </w:rPr>
+      </w:pPr>
+      <w:r>
+        <w:rPr>
+          <w:rFonts w:hint="eastAsia"/>
+          <w:color w:val="FF0000"/>
+        </w:rPr>
+        <w:t>&gt;</w:t>
+      </w:r>
+      <w:r>
+        <w:rPr>
+          <w:color w:val="FF0000"/>
+        </w:rPr>
+        <w:t xml:space="preserve">&gt; </w:t>
+      </w:r>
+      <w:r>
+        <w:rPr>
+          <w:color w:val="FF0000"/>
+        </w:rPr>
+        <w:t>‌</w:t>
+      </w:r>
+      <w:r>
+        <w:rPr>
+          <w:color w:val="FF0000"/>
+        </w:rPr>
+        <w:t>标准配置</w:t>
+      </w:r>
+      <w:r>
+        <w:rPr>
+          <w:color w:val="FF0000"/>
+        </w:rPr>
+        <w:t>‌</w:t>
+      </w:r>
+      <w:r>
+        <w:rPr>
+          <w:color w:val="FF0000"/>
+        </w:rPr>
+        <w:t>：两者均设为</w:t>
+      </w:r>
+      <w:r>
+        <w:rPr>
+          <w:color w:val="FF0000"/>
+        </w:rPr>
+        <w:t xml:space="preserve"> </w:t>
+      </w:r>
+      <w:proofErr w:type="spellStart"/>
+      <w:r>
+        <w:rPr>
+          <w:color w:val="FF0000"/>
+        </w:rPr>
+        <w:t>configKERNEL_INTERRUPT_PRIORITY</w:t>
+      </w:r>
+      <w:proofErr w:type="spellEnd"/>
+      <w:r>
+        <w:rPr>
+          <w:color w:val="FF0000"/>
+        </w:rPr>
+        <w:t>（数值最大，即优先级最低），</w:t>
+      </w:r>
+      <w:r>
+        <w:rPr>
+          <w:color w:val="FF0000"/>
+        </w:rPr>
+        <w:t>‌</w:t>
+      </w:r>
+      <w:r>
+        <w:rPr>
+          <w:color w:val="FF0000"/>
+        </w:rPr>
+        <w:t>优先级相等</w:t>
+      </w:r>
+      <w:r>
+        <w:rPr>
+          <w:color w:val="FF0000"/>
+        </w:rPr>
+        <w:t>‌</w:t>
+      </w:r>
+      <w:r>
+        <w:rPr>
+          <w:color w:val="FF0000"/>
+        </w:rPr>
+        <w:t>。</w:t>
+      </w:r>
+    </w:p>
+    <w:p>
+      <w:pPr>
+        <w:pStyle w:val="a3"/>
+        <w:rPr>
+          <w:rFonts w:hint="eastAsia"/>
+        </w:rPr>
+      </w:pPr>
+      <w:r>
+        <w:rPr>
+          <w:rFonts w:hint="eastAsia"/>
+        </w:rPr>
+        <w:t>&gt;</w:t>
+      </w:r>
+      <w:r>
+        <w:t xml:space="preserve">&gt; </w:t>
+      </w:r>
+      <w:proofErr w:type="spellStart"/>
+      <w:r>
+        <w:rPr>
+          <w:rFonts w:hint="eastAsia"/>
+        </w:rPr>
+        <w:t>ucos</w:t>
+      </w:r>
+      <w:proofErr w:type="spellEnd"/>
+      <w:r>
+        <w:rPr>
+          <w:rFonts w:hint="eastAsia"/>
+        </w:rPr>
+        <w:t>的设计是</w:t>
+      </w:r>
+      <w:proofErr w:type="spellStart"/>
+      <w:r>
+        <w:rPr>
+          <w:rFonts w:hint="eastAsia"/>
+        </w:rPr>
+        <w:t>sys</w:t>
+      </w:r>
+      <w:r>
+        <w:t>tick</w:t>
+      </w:r>
+      <w:proofErr w:type="spellEnd"/>
+      <w:r>
+        <w:t xml:space="preserve"> </w:t>
+      </w:r>
+      <w:r>
+        <w:rPr>
+          <w:rFonts w:hint="eastAsia"/>
+        </w:rPr>
+        <w:t>高于</w:t>
+      </w:r>
+      <w:proofErr w:type="spellStart"/>
+      <w:r>
+        <w:rPr>
+          <w:rFonts w:hint="eastAsia"/>
+        </w:rPr>
+        <w:t>pendsv</w:t>
+      </w:r>
+      <w:proofErr w:type="spellEnd"/>
+      <w:r>
+        <w:t xml:space="preserve"> </w:t>
+      </w:r>
+      <w:r>
+        <w:rPr>
+          <w:rFonts w:hint="eastAsia"/>
+        </w:rPr>
+        <w:t>：因为两者设计思路不一样，</w:t>
+      </w:r>
+      <w:proofErr w:type="spellStart"/>
+      <w:r>
+        <w:rPr>
+          <w:rFonts w:hint="eastAsia"/>
+        </w:rPr>
+        <w:t>ucos</w:t>
+      </w:r>
+      <w:proofErr w:type="spellEnd"/>
+      <w:r>
+        <w:rPr>
+          <w:rFonts w:hint="eastAsia"/>
+        </w:rPr>
+        <w:t>是为了保证</w:t>
+      </w:r>
+      <w:proofErr w:type="spellStart"/>
+      <w:r>
+        <w:rPr>
+          <w:rFonts w:hint="eastAsia"/>
+        </w:rPr>
+        <w:t>systick</w:t>
+      </w:r>
+      <w:proofErr w:type="spellEnd"/>
+      <w:r>
+        <w:rPr>
+          <w:rFonts w:hint="eastAsia"/>
+        </w:rPr>
+        <w:t>的精度更高，面向强实时的场景</w:t>
+      </w:r>
+      <w:r>
+        <w:rPr>
+          <w:rFonts w:hint="eastAsia"/>
+        </w:rPr>
+        <w:t>。而且</w:t>
+      </w:r>
+      <w:proofErr w:type="spellStart"/>
+      <w:r>
+        <w:rPr>
+          <w:rFonts w:hint="eastAsia"/>
+        </w:rPr>
+        <w:t>sys</w:t>
+      </w:r>
+      <w:r>
+        <w:t>tick</w:t>
+      </w:r>
+      <w:proofErr w:type="spellEnd"/>
+      <w:r>
+        <w:rPr>
+          <w:rFonts w:hint="eastAsia"/>
+        </w:rPr>
+        <w:t>代码</w:t>
+      </w:r>
+      <w:proofErr w:type="spellStart"/>
+      <w:r>
+        <w:rPr>
+          <w:rFonts w:hint="eastAsia"/>
+        </w:rPr>
+        <w:t>ucos</w:t>
+      </w:r>
+      <w:proofErr w:type="spellEnd"/>
+      <w:r>
+        <w:rPr>
+          <w:rFonts w:hint="eastAsia"/>
+        </w:rPr>
+        <w:t>的设计非常简洁，即使是打断</w:t>
+      </w:r>
+      <w:proofErr w:type="spellStart"/>
+      <w:r>
+        <w:rPr>
+          <w:rFonts w:hint="eastAsia"/>
+        </w:rPr>
+        <w:t>pendsv</w:t>
+      </w:r>
+      <w:proofErr w:type="spellEnd"/>
+      <w:r>
+        <w:rPr>
+          <w:rFonts w:hint="eastAsia"/>
+        </w:rPr>
+        <w:t>后也不会影响</w:t>
+      </w:r>
+      <w:proofErr w:type="spellStart"/>
+      <w:r>
+        <w:rPr>
+          <w:rFonts w:hint="eastAsia"/>
+        </w:rPr>
+        <w:t>pendsv</w:t>
+      </w:r>
+      <w:proofErr w:type="spellEnd"/>
+      <w:r>
+        <w:rPr>
+          <w:rFonts w:hint="eastAsia"/>
+        </w:rPr>
+        <w:t>太多的时间</w:t>
+      </w:r>
+      <w:r>
+        <w:rPr>
+          <w:rFonts w:hint="eastAsia"/>
+        </w:rPr>
+        <w:t>；</w:t>
+      </w:r>
+      <w:proofErr w:type="spellStart"/>
+      <w:r>
+        <w:rPr>
+          <w:rFonts w:hint="eastAsia"/>
+        </w:rPr>
+        <w:t>freertos</w:t>
+      </w:r>
+      <w:proofErr w:type="spellEnd"/>
+      <w:r>
+        <w:rPr>
+          <w:rFonts w:hint="eastAsia"/>
+        </w:rPr>
+        <w:t>是面向</w:t>
+      </w:r>
+      <w:r>
+        <w:rPr>
+          <w:rFonts w:hint="eastAsia"/>
+        </w:rPr>
+        <w:t>I</w:t>
+      </w:r>
+      <w:r>
+        <w:t>OT</w:t>
+      </w:r>
+      <w:r>
+        <w:rPr>
+          <w:rFonts w:hint="eastAsia"/>
+        </w:rPr>
+        <w:t>市场，</w:t>
+      </w:r>
+      <w:r>
+        <w:rPr>
+          <w:rFonts w:hint="eastAsia"/>
+        </w:rPr>
+        <w:t>一方面</w:t>
+      </w:r>
+      <w:r>
+        <w:rPr>
+          <w:rFonts w:hint="eastAsia"/>
+        </w:rPr>
+        <w:t>考虑了不同硬件平台的兼容性</w:t>
+      </w:r>
+      <w:r>
+        <w:rPr>
+          <w:rFonts w:hint="eastAsia"/>
+        </w:rPr>
+        <w:t>；一方面</w:t>
+      </w:r>
+      <w:proofErr w:type="spellStart"/>
+      <w:r>
+        <w:rPr>
+          <w:rFonts w:hint="eastAsia"/>
+        </w:rPr>
+        <w:t>systick</w:t>
+      </w:r>
+      <w:proofErr w:type="spellEnd"/>
+      <w:r>
+        <w:t xml:space="preserve"> </w:t>
+      </w:r>
+      <w:r>
+        <w:rPr>
+          <w:rFonts w:hint="eastAsia"/>
+        </w:rPr>
+        <w:t>代码较多</w:t>
+      </w:r>
+      <w:r>
+        <w:rPr>
+          <w:rFonts w:hint="eastAsia"/>
+        </w:rPr>
+        <w:t>；</w:t>
+      </w:r>
+      <w:proofErr w:type="spellStart"/>
+      <w:r>
+        <w:t>FreeRTOS</w:t>
+      </w:r>
+      <w:proofErr w:type="spellEnd"/>
+      <w:r>
+        <w:t xml:space="preserve"> </w:t>
+      </w:r>
+      <w:r>
+        <w:t>的选择是：</w:t>
+      </w:r>
+      <w:r>
+        <w:rPr>
+          <w:b/>
+          <w:bCs/>
+        </w:rPr>
+        <w:t>应用中断的实时性</w:t>
+      </w:r>
+      <w:r>
+        <w:rPr>
+          <w:b/>
+          <w:bCs/>
+        </w:rPr>
+        <w:t xml:space="preserve"> &gt; tick </w:t>
+      </w:r>
+      <w:r>
+        <w:rPr>
+          <w:b/>
+          <w:bCs/>
+        </w:rPr>
+        <w:t>精度</w:t>
+      </w:r>
+      <w:r>
+        <w:t>。</w:t>
+      </w:r>
+      <w:r>
+        <w:t xml:space="preserve">tick </w:t>
+      </w:r>
+      <w:r>
+        <w:t>被延迟几十微秒无所谓</w:t>
+      </w:r>
+      <w:r>
+        <w:t>——</w:t>
+      </w:r>
+      <w:r>
+        <w:t>任务调度本来就是毫秒粒度的，</w:t>
+      </w:r>
+      <w:r>
+        <w:t xml:space="preserve">tick jitter </w:t>
+      </w:r>
+      <w:r>
+        <w:t>传导到调度决策上几乎无感。</w:t>
+      </w:r>
+      <w:r>
+        <w:rPr>
+          <w:rStyle w:val="ab"/>
+          <w:rFonts w:ascii="Roboto" w:hAnsi="Roboto"/>
+          <w:color w:val="333333"/>
+          <w:sz w:val="20"/>
+          <w:szCs w:val="20"/>
+          <w:shd w:val="clear" w:color="auto" w:fill="F2F2F2"/>
+        </w:rPr>
+        <w:t>两害相权：让</w:t>
+      </w:r>
+      <w:r>
+        <w:rPr>
+          <w:rStyle w:val="ab"/>
+          <w:rFonts w:ascii="Roboto" w:hAnsi="Roboto"/>
+          <w:color w:val="333333"/>
+          <w:sz w:val="20"/>
+          <w:szCs w:val="20"/>
+          <w:shd w:val="clear" w:color="auto" w:fill="F2F2F2"/>
+        </w:rPr>
+        <w:t>"</w:t>
+      </w:r>
+      <w:r>
+        <w:rPr>
+          <w:rStyle w:val="ab"/>
+          <w:rFonts w:ascii="Roboto" w:hAnsi="Roboto"/>
+          <w:color w:val="333333"/>
+          <w:sz w:val="20"/>
+          <w:szCs w:val="20"/>
+          <w:shd w:val="clear" w:color="auto" w:fill="F2F2F2"/>
+        </w:rPr>
+        <w:t>无害的抖动</w:t>
+      </w:r>
+      <w:r>
+        <w:rPr>
+          <w:rStyle w:val="ab"/>
+          <w:rFonts w:ascii="Roboto" w:hAnsi="Roboto"/>
+          <w:color w:val="333333"/>
+          <w:sz w:val="20"/>
+          <w:szCs w:val="20"/>
+          <w:shd w:val="clear" w:color="auto" w:fill="F2F2F2"/>
+        </w:rPr>
+        <w:t>"</w:t>
+      </w:r>
+      <w:r>
+        <w:rPr>
+          <w:rStyle w:val="ab"/>
+          <w:rFonts w:ascii="Roboto" w:hAnsi="Roboto"/>
+          <w:color w:val="333333"/>
+          <w:sz w:val="20"/>
+          <w:szCs w:val="20"/>
+          <w:shd w:val="clear" w:color="auto" w:fill="F2F2F2"/>
+        </w:rPr>
+        <w:t>落在</w:t>
+      </w:r>
+      <w:r>
+        <w:rPr>
+          <w:rStyle w:val="ab"/>
+          <w:rFonts w:ascii="Roboto" w:hAnsi="Roboto"/>
+          <w:color w:val="333333"/>
+          <w:sz w:val="20"/>
+          <w:szCs w:val="20"/>
+          <w:shd w:val="clear" w:color="auto" w:fill="F2F2F2"/>
+        </w:rPr>
+        <w:t xml:space="preserve"> tick </w:t>
+      </w:r>
+      <w:r>
+        <w:rPr>
+          <w:rStyle w:val="ab"/>
+          <w:rFonts w:ascii="Roboto" w:hAnsi="Roboto"/>
+          <w:color w:val="333333"/>
+          <w:sz w:val="20"/>
+          <w:szCs w:val="20"/>
+          <w:shd w:val="clear" w:color="auto" w:fill="F2F2F2"/>
+        </w:rPr>
+        <w:t>身上，而不是让</w:t>
+      </w:r>
+      <w:r>
+        <w:rPr>
+          <w:rStyle w:val="ab"/>
+          <w:rFonts w:ascii="Roboto" w:hAnsi="Roboto"/>
+          <w:color w:val="333333"/>
+          <w:sz w:val="20"/>
+          <w:szCs w:val="20"/>
+          <w:shd w:val="clear" w:color="auto" w:fill="F2F2F2"/>
+        </w:rPr>
+        <w:t>"</w:t>
+      </w:r>
+      <w:r>
+        <w:rPr>
+          <w:rStyle w:val="ab"/>
+          <w:rFonts w:ascii="Roboto" w:hAnsi="Roboto"/>
+          <w:color w:val="333333"/>
+          <w:sz w:val="20"/>
+          <w:szCs w:val="20"/>
+          <w:shd w:val="clear" w:color="auto" w:fill="F2F2F2"/>
+        </w:rPr>
+        <w:t>致命的延迟</w:t>
+      </w:r>
+      <w:r>
+        <w:rPr>
+          <w:rStyle w:val="ab"/>
+          <w:rFonts w:ascii="Roboto" w:hAnsi="Roboto"/>
+          <w:color w:val="333333"/>
+          <w:sz w:val="20"/>
+          <w:szCs w:val="20"/>
+          <w:shd w:val="clear" w:color="auto" w:fill="F2F2F2"/>
+        </w:rPr>
+        <w:t>"</w:t>
+      </w:r>
+      <w:r>
+        <w:rPr>
+          <w:rStyle w:val="ab"/>
+          <w:rFonts w:ascii="Roboto" w:hAnsi="Roboto"/>
+          <w:color w:val="333333"/>
+          <w:sz w:val="20"/>
+          <w:szCs w:val="20"/>
+          <w:shd w:val="clear" w:color="auto" w:fill="F2F2F2"/>
+        </w:rPr>
+        <w:t>落在应用中断身上。</w:t>
+      </w:r>
+    </w:p>
+    <w:p>
+      <w:pPr>
+        <w:pStyle w:val="2"/>
+        <w:shd w:val="clear" w:color="auto" w:fill="F2F2F2"/>
+        <w:spacing w:line="360" w:lineRule="atLeast"/>
+        <w:rPr>
+          <w:rFonts w:ascii="Roboto" w:hAnsi="Roboto"/>
+          <w:color w:val="333333"/>
+          <w:sz w:val="26"/>
+          <w:szCs w:val="26"/>
+        </w:rPr>
+      </w:pPr>
+      <w:r>
+        <w:rPr>
+          <w:rFonts w:ascii="Roboto" w:hAnsi="Roboto"/>
+          <w:color w:val="333333"/>
+          <w:sz w:val="26"/>
+          <w:szCs w:val="26"/>
+        </w:rPr>
+        <w:t>为什么</w:t>
+      </w:r>
+      <w:r>
+        <w:rPr>
+          <w:rFonts w:ascii="Roboto" w:hAnsi="Roboto"/>
+          <w:color w:val="333333"/>
+          <w:sz w:val="26"/>
+          <w:szCs w:val="26"/>
+        </w:rPr>
+        <w:t xml:space="preserve"> </w:t>
+      </w:r>
+      <w:proofErr w:type="spellStart"/>
+      <w:r>
+        <w:rPr>
+          <w:rFonts w:ascii="Roboto" w:hAnsi="Roboto"/>
+          <w:color w:val="333333"/>
+          <w:sz w:val="26"/>
+          <w:szCs w:val="26"/>
+        </w:rPr>
+        <w:t>uCOS</w:t>
+      </w:r>
+      <w:proofErr w:type="spellEnd"/>
+      <w:r>
+        <w:rPr>
+          <w:rFonts w:ascii="Roboto" w:hAnsi="Roboto"/>
+          <w:color w:val="333333"/>
+          <w:sz w:val="26"/>
+          <w:szCs w:val="26"/>
+        </w:rPr>
+        <w:t xml:space="preserve"> </w:t>
+      </w:r>
+      <w:r>
+        <w:rPr>
+          <w:rFonts w:ascii="Roboto" w:hAnsi="Roboto"/>
+          <w:color w:val="333333"/>
+          <w:sz w:val="26"/>
+          <w:szCs w:val="26"/>
+        </w:rPr>
+        <w:t>能反着来？</w:t>
+      </w:r>
+      <w:r>
+        <w:rPr>
+          <w:rFonts w:ascii="Roboto" w:hAnsi="Roboto"/>
+          <w:color w:val="333333"/>
+          <w:sz w:val="26"/>
+          <w:szCs w:val="26"/>
+        </w:rPr>
+        <w:t>——</w:t>
+      </w:r>
+      <w:r>
+        <w:rPr>
+          <w:rFonts w:ascii="Roboto" w:hAnsi="Roboto"/>
+          <w:color w:val="333333"/>
+          <w:sz w:val="26"/>
+          <w:szCs w:val="26"/>
+        </w:rPr>
+        <w:t>它把</w:t>
+      </w:r>
+      <w:r>
+        <w:rPr>
+          <w:rFonts w:ascii="Roboto" w:hAnsi="Roboto"/>
+          <w:color w:val="333333"/>
+          <w:sz w:val="26"/>
+          <w:szCs w:val="26"/>
+        </w:rPr>
+        <w:t>"</w:t>
+      </w:r>
+      <w:r>
+        <w:rPr>
+          <w:rFonts w:ascii="Roboto" w:hAnsi="Roboto"/>
+          <w:color w:val="333333"/>
+          <w:sz w:val="26"/>
+          <w:szCs w:val="26"/>
+        </w:rPr>
+        <w:t>重活</w:t>
+      </w:r>
+      <w:r>
+        <w:rPr>
+          <w:rFonts w:ascii="Roboto" w:hAnsi="Roboto"/>
+          <w:color w:val="333333"/>
+          <w:sz w:val="26"/>
+          <w:szCs w:val="26"/>
+        </w:rPr>
+        <w:t>"</w:t>
+      </w:r>
+      <w:r>
+        <w:rPr>
+          <w:rFonts w:ascii="Roboto" w:hAnsi="Roboto"/>
+          <w:color w:val="333333"/>
+          <w:sz w:val="26"/>
+          <w:szCs w:val="26"/>
+        </w:rPr>
+        <w:t>搬走了</w:t>
+      </w:r>
+    </w:p>
+    <w:p>
+      <w:pPr>
+        <w:pStyle w:val="ac"/>
+        <w:shd w:val="clear" w:color="auto" w:fill="F2F2F2"/>
+        <w:spacing w:before="0" w:beforeAutospacing="0" w:after="0" w:afterAutospacing="0"/>
+        <w:rPr>
+          <w:rFonts w:ascii="Roboto" w:hAnsi="Roboto"/>
+          <w:color w:val="333333"/>
+          <w:sz w:val="20"/>
+          <w:szCs w:val="20"/>
+        </w:rPr>
+      </w:pPr>
+      <w:proofErr w:type="spellStart"/>
+      <w:r>
+        <w:rPr>
+          <w:rFonts w:ascii="Roboto" w:hAnsi="Roboto"/>
+          <w:color w:val="333333"/>
+          <w:sz w:val="20"/>
+          <w:szCs w:val="20"/>
+        </w:rPr>
+        <w:t>uCOS</w:t>
+      </w:r>
+      <w:proofErr w:type="spellEnd"/>
+      <w:r>
+        <w:rPr>
+          <w:rFonts w:ascii="Roboto" w:hAnsi="Roboto"/>
+          <w:color w:val="333333"/>
+          <w:sz w:val="20"/>
+          <w:szCs w:val="20"/>
+        </w:rPr>
+        <w:t xml:space="preserve">-III </w:t>
+      </w:r>
+      <w:r>
+        <w:rPr>
+          <w:rFonts w:ascii="Roboto" w:hAnsi="Roboto"/>
+          <w:color w:val="333333"/>
+          <w:sz w:val="20"/>
+          <w:szCs w:val="20"/>
+        </w:rPr>
+        <w:t>的</w:t>
+      </w:r>
+      <w:r>
+        <w:rPr>
+          <w:rFonts w:ascii="Cambria" w:hAnsi="Cambria" w:cs="Cambria"/>
+          <w:color w:val="333333"/>
+          <w:sz w:val="20"/>
+          <w:szCs w:val="20"/>
+        </w:rPr>
+        <w:t> </w:t>
+      </w:r>
+      <w:proofErr w:type="spellStart"/>
+      <w:r>
+        <w:rPr>
+          <w:rStyle w:val="HTML"/>
+          <w:color w:val="333333"/>
+        </w:rPr>
+        <w:t>OSTimeTick</w:t>
+      </w:r>
+      <w:proofErr w:type="spellEnd"/>
+      <w:r>
+        <w:rPr>
+          <w:rStyle w:val="HTML"/>
+          <w:color w:val="333333"/>
+        </w:rPr>
+        <w:t>()</w:t>
+      </w:r>
+      <w:r>
+        <w:rPr>
+          <w:rFonts w:ascii="Cambria" w:hAnsi="Cambria" w:cs="Cambria"/>
+          <w:color w:val="333333"/>
+          <w:sz w:val="20"/>
+          <w:szCs w:val="20"/>
+        </w:rPr>
+        <w:t> </w:t>
+      </w:r>
+      <w:r>
+        <w:rPr>
+          <w:rFonts w:ascii="Roboto" w:hAnsi="Roboto"/>
+          <w:color w:val="333333"/>
+          <w:sz w:val="20"/>
+          <w:szCs w:val="20"/>
+        </w:rPr>
+        <w:t>只做一个动作：</w:t>
+      </w:r>
+      <w:r>
+        <w:rPr>
+          <w:rFonts w:ascii="Roboto" w:hAnsi="Roboto"/>
+          <w:color w:val="333333"/>
+          <w:sz w:val="20"/>
+          <w:szCs w:val="20"/>
+        </w:rPr>
+        <w:t xml:space="preserve">post </w:t>
+      </w:r>
+      <w:r>
+        <w:rPr>
+          <w:rFonts w:ascii="Roboto" w:hAnsi="Roboto"/>
+          <w:color w:val="333333"/>
+          <w:sz w:val="20"/>
+          <w:szCs w:val="20"/>
+        </w:rPr>
+        <w:t>一个信号给</w:t>
+      </w:r>
+      <w:r>
+        <w:rPr>
+          <w:rFonts w:ascii="Cambria" w:hAnsi="Cambria" w:cs="Cambria"/>
+          <w:color w:val="333333"/>
+          <w:sz w:val="20"/>
+          <w:szCs w:val="20"/>
+        </w:rPr>
+        <w:t> </w:t>
+      </w:r>
+      <w:proofErr w:type="spellStart"/>
+      <w:r>
+        <w:rPr>
+          <w:rStyle w:val="ab"/>
+          <w:rFonts w:ascii="Roboto" w:hAnsi="Roboto"/>
+          <w:color w:val="333333"/>
+          <w:sz w:val="20"/>
+          <w:szCs w:val="20"/>
+        </w:rPr>
+        <w:t>OS_TickTask</w:t>
+      </w:r>
+      <w:proofErr w:type="spellEnd"/>
+      <w:r>
+        <w:rPr>
+          <w:rFonts w:ascii="Roboto" w:hAnsi="Roboto"/>
+          <w:color w:val="333333"/>
+          <w:sz w:val="20"/>
+          <w:szCs w:val="20"/>
+        </w:rPr>
+        <w:t>（一个内核任务），</w:t>
+      </w:r>
+      <w:proofErr w:type="gramStart"/>
+      <w:r>
+        <w:rPr>
+          <w:rFonts w:ascii="Roboto" w:hAnsi="Roboto"/>
+          <w:color w:val="333333"/>
+          <w:sz w:val="20"/>
+          <w:szCs w:val="20"/>
+        </w:rPr>
+        <w:t>纳秒级</w:t>
+      </w:r>
+      <w:proofErr w:type="gramEnd"/>
+      <w:r>
+        <w:rPr>
+          <w:rFonts w:ascii="Roboto" w:hAnsi="Roboto"/>
+          <w:color w:val="333333"/>
+          <w:sz w:val="20"/>
+          <w:szCs w:val="20"/>
+        </w:rPr>
+        <w:t>完事。遍历延时列表的活在</w:t>
+      </w:r>
+      <w:proofErr w:type="gramStart"/>
+      <w:r>
+        <w:rPr>
+          <w:rStyle w:val="ab"/>
+          <w:rFonts w:ascii="Roboto" w:hAnsi="Roboto"/>
+          <w:color w:val="333333"/>
+          <w:sz w:val="20"/>
+          <w:szCs w:val="20"/>
+        </w:rPr>
+        <w:t>任务级</w:t>
+      </w:r>
+      <w:proofErr w:type="gramEnd"/>
+      <w:r>
+        <w:rPr>
+          <w:rFonts w:ascii="Roboto" w:hAnsi="Roboto"/>
+          <w:color w:val="333333"/>
+          <w:sz w:val="20"/>
+          <w:szCs w:val="20"/>
+        </w:rPr>
+        <w:t>做，不在</w:t>
+      </w:r>
+      <w:r>
+        <w:rPr>
+          <w:rFonts w:ascii="Roboto" w:hAnsi="Roboto"/>
+          <w:color w:val="333333"/>
+          <w:sz w:val="20"/>
+          <w:szCs w:val="20"/>
+        </w:rPr>
+        <w:t xml:space="preserve"> ISR </w:t>
+      </w:r>
+      <w:r>
+        <w:rPr>
+          <w:rFonts w:ascii="Roboto" w:hAnsi="Roboto"/>
+          <w:color w:val="333333"/>
+          <w:sz w:val="20"/>
+          <w:szCs w:val="20"/>
+        </w:rPr>
+        <w:t>里做。</w:t>
+      </w:r>
+    </w:p>
+    <w:p>
+      <w:pPr>
+        <w:pStyle w:val="ac"/>
+        <w:shd w:val="clear" w:color="auto" w:fill="F2F2F2"/>
+        <w:spacing w:before="0" w:beforeAutospacing="0" w:after="0" w:afterAutospacing="0"/>
+        <w:rPr>
+          <w:rFonts w:ascii="Roboto" w:hAnsi="Roboto"/>
+          <w:color w:val="333333"/>
+          <w:sz w:val="20"/>
+          <w:szCs w:val="20"/>
+        </w:rPr>
+      </w:pPr>
+      <w:r>
+        <w:rPr>
+          <w:rFonts w:ascii="Roboto" w:hAnsi="Roboto"/>
+          <w:color w:val="333333"/>
+          <w:sz w:val="20"/>
+          <w:szCs w:val="20"/>
+        </w:rPr>
+        <w:t xml:space="preserve">ISR </w:t>
+      </w:r>
+      <w:r>
+        <w:rPr>
+          <w:rFonts w:ascii="Roboto" w:hAnsi="Roboto"/>
+          <w:color w:val="333333"/>
+          <w:sz w:val="20"/>
+          <w:szCs w:val="20"/>
+        </w:rPr>
+        <w:t>短到几乎零伤害</w:t>
+      </w:r>
+      <w:r>
+        <w:rPr>
+          <w:rFonts w:ascii="Roboto" w:hAnsi="Roboto"/>
+          <w:color w:val="333333"/>
+          <w:sz w:val="20"/>
+          <w:szCs w:val="20"/>
+        </w:rPr>
+        <w:t xml:space="preserve"> → </w:t>
+      </w:r>
+      <w:r>
+        <w:rPr>
+          <w:rFonts w:ascii="Roboto" w:hAnsi="Roboto"/>
+          <w:color w:val="333333"/>
+          <w:sz w:val="20"/>
+          <w:szCs w:val="20"/>
+        </w:rPr>
+        <w:t>设高优先级也拖不慢任何人</w:t>
+      </w:r>
+      <w:r>
+        <w:rPr>
+          <w:rFonts w:ascii="Roboto" w:hAnsi="Roboto"/>
+          <w:color w:val="333333"/>
+          <w:sz w:val="20"/>
+          <w:szCs w:val="20"/>
+        </w:rPr>
+        <w:t xml:space="preserve"> → </w:t>
+      </w:r>
+      <w:r>
+        <w:rPr>
+          <w:rFonts w:ascii="Roboto" w:hAnsi="Roboto"/>
+          <w:color w:val="333333"/>
+          <w:sz w:val="20"/>
+          <w:szCs w:val="20"/>
+        </w:rPr>
+        <w:t>于是它有资格站高位，换</w:t>
+      </w:r>
+      <w:r>
+        <w:rPr>
+          <w:rFonts w:ascii="Roboto" w:hAnsi="Roboto"/>
+          <w:color w:val="333333"/>
+          <w:sz w:val="20"/>
+          <w:szCs w:val="20"/>
+        </w:rPr>
+        <w:t xml:space="preserve"> tick </w:t>
+      </w:r>
+      <w:r>
+        <w:rPr>
+          <w:rFonts w:ascii="Roboto" w:hAnsi="Roboto"/>
+          <w:color w:val="333333"/>
+          <w:sz w:val="20"/>
+          <w:szCs w:val="20"/>
+        </w:rPr>
+        <w:t>精准。</w:t>
+      </w:r>
+    </w:p>
+    <w:p>
+      <w:pPr>
+        <w:pStyle w:val="ac"/>
+        <w:shd w:val="clear" w:color="auto" w:fill="F2F2F2"/>
+        <w:spacing w:before="0" w:beforeAutospacing="0" w:after="0" w:afterAutospacing="0"/>
+        <w:rPr>
+          <w:rFonts w:ascii="Roboto" w:hAnsi="Roboto"/>
+          <w:color w:val="333333"/>
+          <w:sz w:val="20"/>
+          <w:szCs w:val="20"/>
+        </w:rPr>
+      </w:pPr>
+      <w:r>
+        <w:rPr>
+          <w:rFonts w:ascii="Roboto" w:hAnsi="Roboto"/>
+          <w:color w:val="333333"/>
+          <w:sz w:val="20"/>
+          <w:szCs w:val="20"/>
+        </w:rPr>
+        <w:t>所以完整的原则是：</w:t>
+      </w:r>
+    </w:p>
+    <w:p>
+      <w:pPr>
+        <w:pStyle w:val="ac"/>
+        <w:spacing w:before="0" w:beforeAutospacing="0" w:after="0" w:afterAutospacing="0"/>
+        <w:rPr>
+          <w:rFonts w:ascii="Roboto" w:hAnsi="Roboto"/>
+          <w:color w:val="333333"/>
+          <w:sz w:val="20"/>
+          <w:szCs w:val="20"/>
+        </w:rPr>
+      </w:pPr>
+      <w:r>
+        <w:rPr>
+          <w:rStyle w:val="ab"/>
+          <w:rFonts w:ascii="Roboto" w:hAnsi="Roboto"/>
+          <w:color w:val="333333"/>
+          <w:sz w:val="20"/>
+          <w:szCs w:val="20"/>
+        </w:rPr>
+        <w:t xml:space="preserve">ISR </w:t>
+      </w:r>
+      <w:r>
+        <w:rPr>
+          <w:rStyle w:val="ab"/>
+          <w:rFonts w:ascii="Roboto" w:hAnsi="Roboto"/>
+          <w:color w:val="333333"/>
+          <w:sz w:val="20"/>
+          <w:szCs w:val="20"/>
+        </w:rPr>
+        <w:t>越短，才有</w:t>
+      </w:r>
+      <w:proofErr w:type="gramStart"/>
+      <w:r>
+        <w:rPr>
+          <w:rStyle w:val="ab"/>
+          <w:rFonts w:ascii="Roboto" w:hAnsi="Roboto"/>
+          <w:color w:val="333333"/>
+          <w:sz w:val="20"/>
+          <w:szCs w:val="20"/>
+        </w:rPr>
+        <w:t>资格站越高</w:t>
+      </w:r>
+      <w:proofErr w:type="gramEnd"/>
+      <w:r>
+        <w:rPr>
+          <w:rStyle w:val="ab"/>
+          <w:rFonts w:ascii="Roboto" w:hAnsi="Roboto"/>
+          <w:color w:val="333333"/>
+          <w:sz w:val="20"/>
+          <w:szCs w:val="20"/>
+        </w:rPr>
+        <w:t>的优先级；</w:t>
+      </w:r>
+      <w:r>
+        <w:rPr>
+          <w:rStyle w:val="ab"/>
+          <w:rFonts w:ascii="Roboto" w:hAnsi="Roboto"/>
+          <w:color w:val="333333"/>
+          <w:sz w:val="20"/>
+          <w:szCs w:val="20"/>
+        </w:rPr>
+        <w:t xml:space="preserve">ISR </w:t>
+      </w:r>
+      <w:r>
+        <w:rPr>
+          <w:rStyle w:val="ab"/>
+          <w:rFonts w:ascii="Roboto" w:hAnsi="Roboto"/>
+          <w:color w:val="333333"/>
+          <w:sz w:val="20"/>
+          <w:szCs w:val="20"/>
+        </w:rPr>
+        <w:t>长，功能再重要也得压低</w:t>
+      </w:r>
+      <w:r>
+        <w:rPr>
+          <w:rStyle w:val="ab"/>
+          <w:rFonts w:ascii="Roboto" w:hAnsi="Roboto"/>
+          <w:color w:val="333333"/>
+          <w:sz w:val="20"/>
+          <w:szCs w:val="20"/>
+        </w:rPr>
+        <w:t>——</w:t>
+      </w:r>
+      <w:r>
+        <w:rPr>
+          <w:rStyle w:val="ab"/>
+          <w:rFonts w:ascii="Roboto" w:hAnsi="Roboto"/>
+          <w:color w:val="333333"/>
+          <w:sz w:val="20"/>
+          <w:szCs w:val="20"/>
+        </w:rPr>
+        <w:t>或者学</w:t>
+      </w:r>
+      <w:r>
+        <w:rPr>
+          <w:rStyle w:val="ab"/>
+          <w:rFonts w:ascii="Roboto" w:hAnsi="Roboto"/>
+          <w:color w:val="333333"/>
+          <w:sz w:val="20"/>
+          <w:szCs w:val="20"/>
+        </w:rPr>
+        <w:t xml:space="preserve"> </w:t>
+      </w:r>
+      <w:proofErr w:type="spellStart"/>
+      <w:r>
+        <w:rPr>
+          <w:rStyle w:val="ab"/>
+          <w:rFonts w:ascii="Roboto" w:hAnsi="Roboto"/>
+          <w:color w:val="333333"/>
+          <w:sz w:val="20"/>
+          <w:szCs w:val="20"/>
+        </w:rPr>
+        <w:t>uCOS</w:t>
+      </w:r>
+      <w:proofErr w:type="spellEnd"/>
+      <w:r>
+        <w:rPr>
+          <w:rStyle w:val="ab"/>
+          <w:rFonts w:ascii="Roboto" w:hAnsi="Roboto"/>
+          <w:color w:val="333333"/>
+          <w:sz w:val="20"/>
+          <w:szCs w:val="20"/>
+        </w:rPr>
+        <w:t xml:space="preserve"> </w:t>
+      </w:r>
+      <w:r>
+        <w:rPr>
+          <w:rStyle w:val="ab"/>
+          <w:rFonts w:ascii="Roboto" w:hAnsi="Roboto"/>
+          <w:color w:val="333333"/>
+          <w:sz w:val="20"/>
+          <w:szCs w:val="20"/>
+        </w:rPr>
+        <w:t>把活搬到任务里，把</w:t>
+      </w:r>
+      <w:r>
+        <w:rPr>
+          <w:rStyle w:val="ab"/>
+          <w:rFonts w:ascii="Roboto" w:hAnsi="Roboto"/>
+          <w:color w:val="333333"/>
+          <w:sz w:val="20"/>
+          <w:szCs w:val="20"/>
+        </w:rPr>
+        <w:t xml:space="preserve"> ISR </w:t>
+      </w:r>
+      <w:r>
+        <w:rPr>
+          <w:rStyle w:val="ab"/>
+          <w:rFonts w:ascii="Roboto" w:hAnsi="Roboto"/>
+          <w:color w:val="333333"/>
+          <w:sz w:val="20"/>
+          <w:szCs w:val="20"/>
+        </w:rPr>
+        <w:t>变短后再升高。</w:t>
+      </w:r>
+    </w:p>
+    <w:p>
+      <w:pPr>
+        <w:pStyle w:val="ac"/>
+        <w:shd w:val="clear" w:color="auto" w:fill="F2F2F2"/>
+        <w:spacing w:before="0" w:beforeAutospacing="0" w:after="0" w:afterAutospacing="0"/>
+        <w:rPr>
+          <w:rFonts w:ascii="Roboto" w:hAnsi="Roboto"/>
+          <w:color w:val="333333"/>
+          <w:sz w:val="20"/>
+          <w:szCs w:val="20"/>
+        </w:rPr>
+      </w:pPr>
+      <w:proofErr w:type="spellStart"/>
+      <w:r>
+        <w:rPr>
+          <w:rFonts w:ascii="Roboto" w:hAnsi="Roboto"/>
+          <w:color w:val="333333"/>
+          <w:sz w:val="20"/>
+          <w:szCs w:val="20"/>
+        </w:rPr>
+        <w:lastRenderedPageBreak/>
+        <w:t>FreeRTOS</w:t>
+      </w:r>
+      <w:proofErr w:type="spellEnd"/>
+      <w:r>
+        <w:rPr>
+          <w:rFonts w:ascii="Roboto" w:hAnsi="Roboto"/>
+          <w:color w:val="333333"/>
+          <w:sz w:val="20"/>
+          <w:szCs w:val="20"/>
+        </w:rPr>
+        <w:t xml:space="preserve"> </w:t>
+      </w:r>
+      <w:r>
+        <w:rPr>
+          <w:rFonts w:ascii="Roboto" w:hAnsi="Roboto"/>
+          <w:color w:val="333333"/>
+          <w:sz w:val="20"/>
+          <w:szCs w:val="20"/>
+        </w:rPr>
+        <w:t>没做</w:t>
+      </w:r>
+      <w:r>
+        <w:rPr>
+          <w:rFonts w:ascii="Roboto" w:hAnsi="Roboto"/>
+          <w:color w:val="333333"/>
+          <w:sz w:val="20"/>
+          <w:szCs w:val="20"/>
+        </w:rPr>
+        <w:t>"</w:t>
+      </w:r>
+      <w:r>
+        <w:rPr>
+          <w:rFonts w:ascii="Roboto" w:hAnsi="Roboto"/>
+          <w:color w:val="333333"/>
+          <w:sz w:val="20"/>
+          <w:szCs w:val="20"/>
+        </w:rPr>
+        <w:t>搬到任务里</w:t>
+      </w:r>
+      <w:r>
+        <w:rPr>
+          <w:rFonts w:ascii="Roboto" w:hAnsi="Roboto"/>
+          <w:color w:val="333333"/>
+          <w:sz w:val="20"/>
+          <w:szCs w:val="20"/>
+        </w:rPr>
+        <w:t>"</w:t>
+      </w:r>
+      <w:r>
+        <w:rPr>
+          <w:rFonts w:ascii="Roboto" w:hAnsi="Roboto"/>
+          <w:color w:val="333333"/>
+          <w:sz w:val="20"/>
+          <w:szCs w:val="20"/>
+        </w:rPr>
+        <w:t>这个架构（为了代码简单），</w:t>
+      </w:r>
+      <w:r>
+        <w:rPr>
+          <w:rFonts w:ascii="Roboto" w:hAnsi="Roboto"/>
+          <w:color w:val="333333"/>
+          <w:sz w:val="20"/>
+          <w:szCs w:val="20"/>
+        </w:rPr>
+        <w:t xml:space="preserve">tick ISR </w:t>
+      </w:r>
+      <w:r>
+        <w:rPr>
+          <w:rFonts w:ascii="Roboto" w:hAnsi="Roboto"/>
+          <w:color w:val="333333"/>
+          <w:sz w:val="20"/>
+          <w:szCs w:val="20"/>
+        </w:rPr>
+        <w:t>长度不可控</w:t>
+      </w:r>
+      <w:r>
+        <w:rPr>
+          <w:rFonts w:ascii="Roboto" w:hAnsi="Roboto"/>
+          <w:color w:val="333333"/>
+          <w:sz w:val="20"/>
+          <w:szCs w:val="20"/>
+        </w:rPr>
+        <w:t xml:space="preserve"> → </w:t>
+      </w:r>
+      <w:r>
+        <w:rPr>
+          <w:rFonts w:ascii="Roboto" w:hAnsi="Roboto"/>
+          <w:color w:val="333333"/>
+          <w:sz w:val="20"/>
+          <w:szCs w:val="20"/>
+        </w:rPr>
+        <w:t>唯一的选择就是压低。</w:t>
+      </w:r>
     </w:p>
     <w:p>
       <w:pPr>
@@ -2094,8 +3526,13 @@
       <w:r>
         <w:t xml:space="preserve">2. </w:t>
       </w:r>
-      <w:r>
-        <w:t>某任务主动放弃</w:t>
+      <w:proofErr w:type="gramStart"/>
+      <w:r>
+        <w:t>某任务</w:t>
+      </w:r>
+      <w:proofErr w:type="gramEnd"/>
+      <w:r>
+        <w:t>主动放弃</w:t>
       </w:r>
       <w:r>
         <w:t xml:space="preserve">CPU </w:t>
@@ -2221,7 +3658,15 @@
         <w:t xml:space="preserve">2. </w:t>
       </w:r>
       <w:r>
-        <w:t>优先级分配方法一：哪个任务执行的次数最频繁</w:t>
+        <w:t>优先级分配方法</w:t>
+      </w:r>
+      <w:proofErr w:type="gramStart"/>
+      <w:r>
+        <w:t>一</w:t>
+      </w:r>
+      <w:proofErr w:type="gramEnd"/>
+      <w:r>
+        <w:t>：哪个任务执行的次数最频繁</w:t>
       </w:r>
       <w:r>
         <w:t>,</w:t>
@@ -2261,7 +3706,7 @@
 </file>
 
 <file path=word/endnotes.xml><?xml version="1.0" encoding="utf-8"?>
-<w:endnotes xmlns:wpc="http://schemas.microsoft.com/office/word/2010/wordprocessingCanvas" xmlns:cx="http://schemas.microsoft.com/office/drawing/2014/chartex" xmlns:cx1="http://schemas.microsoft.com/office/drawing/2015/9/8/chartex" xmlns:mc="http://schemas.openxmlformats.org/markup-compatibility/2006" xmlns:o="urn:schemas-microsoft-com:office:office" xmlns:r="http://schemas.openxmlformats.org/officeDocument/2006/relationships" xmlns:m="http://schemas.openxmlformats.org/officeDocument/2006/math" xmlns:v="urn:schemas-microsoft-com:vml" xmlns:wp14="http://schemas.microsoft.com/office/word/2010/wordprocessingDrawing" xmlns:wp="http://schemas.openxmlformats.org/drawingml/2006/wordprocessingDrawing" xmlns:w10="urn:schemas-microsoft-com:office:word" xmlns:w="http://schemas.openxmlformats.org/wordprocessingml/2006/main" xmlns:w14="http://schemas.microsoft.com/office/word/2010/wordml" xmlns:w15="http://schemas.microsoft.com/office/word/2012/wordml" xmlns:w16se="http://schemas.microsoft.com/office/word/2015/wordml/symex" xmlns:wpg="http://schemas.microsoft.com/office/word/2010/wordprocessingGroup" xmlns:wpi="http://schemas.microsoft.com/office/word/2010/wordprocessingInk" xmlns:wne="http://schemas.microsoft.com/office/word/2006/wordml" xmlns:wps="http://schemas.microsoft.com/office/word/2010/wordprocessingShape" mc:Ignorable="w14 w15 w16se wp14">
+<w:endnotes xmlns:wpc="http://schemas.microsoft.com/office/word/2010/wordprocessingCanvas" xmlns:cx="http://schemas.microsoft.com/office/drawing/2014/chartex" xmlns:cx1="http://schemas.microsoft.com/office/drawing/2015/9/8/chartex" xmlns:cx2="http://schemas.microsoft.com/office/drawing/2015/10/21/chartex" xmlns:cx3="http://schemas.microsoft.com/office/drawing/2016/5/9/chartex" xmlns:cx4="http://schemas.microsoft.com/office/drawing/2016/5/10/chartex" xmlns:cx5="http://schemas.microsoft.com/office/drawing/2016/5/11/chartex" xmlns:cx6="http://schemas.microsoft.com/office/drawing/2016/5/12/chartex" xmlns:cx7="http://schemas.microsoft.com/office/drawing/2016/5/13/chartex" xmlns:cx8="http://schemas.microsoft.com/office/drawing/2016/5/14/chartex" xmlns:mc="http://schemas.openxmlformats.org/markup-compatibility/2006" xmlns:aink="http://schemas.microsoft.com/office/drawing/2016/ink" xmlns:am3d="http://schemas.microsoft.com/office/drawing/2017/model3d" xmlns:o="urn:schemas-microsoft-com:office:office" xmlns:r="http://schemas.openxmlformats.org/officeDocument/2006/relationships" xmlns:m="http://schemas.openxmlformats.org/officeDocument/2006/math" xmlns:v="urn:schemas-microsoft-com:vml" xmlns:wp14="http://schemas.microsoft.com/office/word/2010/wordprocessingDrawing" xmlns:wp="http://schemas.openxmlformats.org/drawingml/2006/wordprocessingDrawing" xmlns:w10="urn:schemas-microsoft-com:office:word" xmlns:w="http://schemas.openxmlformats.org/wordprocessingml/2006/main" xmlns:w14="http://schemas.microsoft.com/office/word/2010/wordml" xmlns:w15="http://schemas.microsoft.com/office/word/2012/wordml" xmlns:w16cex="http://schemas.microsoft.com/office/word/2018/wordml/cex" xmlns:w16cid="http://schemas.microsoft.com/office/word/2016/wordml/cid" xmlns:w16="http://schemas.microsoft.com/office/word/2018/wordml" xmlns:w16sdtdh="http://schemas.microsoft.com/office/word/2020/wordml/sdtdatahash" xmlns:w16se="http://schemas.microsoft.com/office/word/2015/wordml/symex" xmlns:wpg="http://schemas.microsoft.com/office/word/2010/wordprocessingGroup" xmlns:wpi="http://schemas.microsoft.com/office/word/2010/wordprocessingInk" xmlns:wne="http://schemas.microsoft.com/office/word/2006/wordml" xmlns:wps="http://schemas.microsoft.com/office/word/2010/wordprocessingShape" mc:Ignorable="w14 w15 w16se w16cid w16 w16cex w16sdtdh wp14">
   <w:endnote w:type="separator" w:id="-1">
     <w:p>
       <w:r>
@@ -2280,7 +3725,7 @@
 </file>
 
 <file path=word/footnotes.xml><?xml version="1.0" encoding="utf-8"?>
-<w:footnotes xmlns:wpc="http://schemas.microsoft.com/office/word/2010/wordprocessingCanvas" xmlns:cx="http://schemas.microsoft.com/office/drawing/2014/chartex" xmlns:cx1="http://schemas.microsoft.com/office/drawing/2015/9/8/chartex" xmlns:mc="http://schemas.openxmlformats.org/markup-compatibility/2006" xmlns:o="urn:schemas-microsoft-com:office:office" xmlns:r="http://schemas.openxmlformats.org/officeDocument/2006/relationships" xmlns:m="http://schemas.openxmlformats.org/officeDocument/2006/math" xmlns:v="urn:schemas-microsoft-com:vml" xmlns:wp14="http://schemas.microsoft.com/office/word/2010/wordprocessingDrawing" xmlns:wp="http://schemas.openxmlformats.org/drawingml/2006/wordprocessingDrawing" xmlns:w10="urn:schemas-microsoft-com:office:word" xmlns:w="http://schemas.openxmlformats.org/wordprocessingml/2006/main" xmlns:w14="http://schemas.microsoft.com/office/word/2010/wordml" xmlns:w15="http://schemas.microsoft.com/office/word/2012/wordml" xmlns:w16se="http://schemas.microsoft.com/office/word/2015/wordml/symex" xmlns:wpg="http://schemas.microsoft.com/office/word/2010/wordprocessingGroup" xmlns:wpi="http://schemas.microsoft.com/office/word/2010/wordprocessingInk" xmlns:wne="http://schemas.microsoft.com/office/word/2006/wordml" xmlns:wps="http://schemas.microsoft.com/office/word/2010/wordprocessingShape" mc:Ignorable="w14 w15 w16se wp14">
+<w:footnotes xmlns:wpc="http://schemas.microsoft.com/office/word/2010/wordprocessingCanvas" xmlns:cx="http://schemas.microsoft.com/office/drawing/2014/chartex" xmlns:cx1="http://schemas.microsoft.com/office/drawing/2015/9/8/chartex" xmlns:cx2="http://schemas.microsoft.com/office/drawing/2015/10/21/chartex" xmlns:cx3="http://schemas.microsoft.com/office/drawing/2016/5/9/chartex" xmlns:cx4="http://schemas.microsoft.com/office/drawing/2016/5/10/chartex" xmlns:cx5="http://schemas.microsoft.com/office/drawing/2016/5/11/chartex" xmlns:cx6="http://schemas.microsoft.com/office/drawing/2016/5/12/chartex" xmlns:cx7="http://schemas.microsoft.com/office/drawing/2016/5/13/chartex" xmlns:cx8="http://schemas.microsoft.com/office/drawing/2016/5/14/chartex" xmlns:mc="http://schemas.openxmlformats.org/markup-compatibility/2006" xmlns:aink="http://schemas.microsoft.com/office/drawing/2016/ink" xmlns:am3d="http://schemas.microsoft.com/office/drawing/2017/model3d" xmlns:o="urn:schemas-microsoft-com:office:office" xmlns:r="http://schemas.openxmlformats.org/officeDocument/2006/relationships" xmlns:m="http://schemas.openxmlformats.org/officeDocument/2006/math" xmlns:v="urn:schemas-microsoft-com:vml" xmlns:wp14="http://schemas.microsoft.com/office/word/2010/wordprocessingDrawing" xmlns:wp="http://schemas.openxmlformats.org/drawingml/2006/wordprocessingDrawing" xmlns:w10="urn:schemas-microsoft-com:office:word" xmlns:w="http://schemas.openxmlformats.org/wordprocessingml/2006/main" xmlns:w14="http://schemas.microsoft.com/office/word/2010/wordml" xmlns:w15="http://schemas.microsoft.com/office/word/2012/wordml" xmlns:w16cex="http://schemas.microsoft.com/office/word/2018/wordml/cex" xmlns:w16cid="http://schemas.microsoft.com/office/word/2016/wordml/cid" xmlns:w16="http://schemas.microsoft.com/office/word/2018/wordml" xmlns:w16sdtdh="http://schemas.microsoft.com/office/word/2020/wordml/sdtdatahash" xmlns:w16se="http://schemas.microsoft.com/office/word/2015/wordml/symex" xmlns:wpg="http://schemas.microsoft.com/office/word/2010/wordprocessingGroup" xmlns:wpi="http://schemas.microsoft.com/office/word/2010/wordprocessingInk" xmlns:wne="http://schemas.microsoft.com/office/word/2006/wordml" xmlns:wps="http://schemas.microsoft.com/office/word/2010/wordprocessingShape" mc:Ignorable="w14 w15 w16se w16cid w16 w16cex w16sdtdh wp14">
   <w:footnote w:type="separator" w:id="-1">
     <w:p>
       <w:r>
@@ -2299,7 +3744,7 @@
 </file>
 
 <file path=word/numbering.xml><?xml version="1.0" encoding="utf-8"?>
-<w:numbering xmlns:wpc="http://schemas.microsoft.com/office/word/2010/wordprocessingCanvas" xmlns:cx="http://schemas.microsoft.com/office/drawing/2014/chartex" xmlns:cx1="http://schemas.microsoft.com/office/drawing/2015/9/8/chartex" xmlns:mc="http://schemas.openxmlformats.org/markup-compatibility/2006" xmlns:o="urn:schemas-microsoft-com:office:office" xmlns:r="http://schemas.openxmlformats.org/officeDocument/2006/relationships" xmlns:m="http://schemas.openxmlformats.org/officeDocument/2006/math" xmlns:v="urn:schemas-microsoft-com:vml" xmlns:wp14="http://schemas.microsoft.com/office/word/2010/wordprocessingDrawing" xmlns:wp="http://schemas.openxmlformats.org/drawingml/2006/wordprocessingDrawing" xmlns:w10="urn:schemas-microsoft-com:office:word" xmlns:w="http://schemas.openxmlformats.org/wordprocessingml/2006/main" xmlns:w14="http://schemas.microsoft.com/office/word/2010/wordml" xmlns:w15="http://schemas.microsoft.com/office/word/2012/wordml" xmlns:w16se="http://schemas.microsoft.com/office/word/2015/wordml/symex" xmlns:wpg="http://schemas.microsoft.com/office/word/2010/wordprocessingGroup" xmlns:wpi="http://schemas.microsoft.com/office/word/2010/wordprocessingInk" xmlns:wne="http://schemas.microsoft.com/office/word/2006/wordml" xmlns:wps="http://schemas.microsoft.com/office/word/2010/wordprocessingShape" mc:Ignorable="w14 w15 w16se wp14">
+<w:numbering xmlns:wpc="http://schemas.microsoft.com/office/word/2010/wordprocessingCanvas" xmlns:cx="http://schemas.microsoft.com/office/drawing/2014/chartex" xmlns:cx1="http://schemas.microsoft.com/office/drawing/2015/9/8/chartex" xmlns:cx2="http://schemas.microsoft.com/office/drawing/2015/10/21/chartex" xmlns:cx3="http://schemas.microsoft.com/office/drawing/2016/5/9/chartex" xmlns:cx4="http://schemas.microsoft.com/office/drawing/2016/5/10/chartex" xmlns:cx5="http://schemas.microsoft.com/office/drawing/2016/5/11/chartex" xmlns:cx6="http://schemas.microsoft.com/office/drawing/2016/5/12/chartex" xmlns:cx7="http://schemas.microsoft.com/office/drawing/2016/5/13/chartex" xmlns:cx8="http://schemas.microsoft.com/office/drawing/2016/5/14/chartex" xmlns:mc="http://schemas.openxmlformats.org/markup-compatibility/2006" xmlns:aink="http://schemas.microsoft.com/office/drawing/2016/ink" xmlns:am3d="http://schemas.microsoft.com/office/drawing/2017/model3d" xmlns:o="urn:schemas-microsoft-com:office:office" xmlns:r="http://schemas.openxmlformats.org/officeDocument/2006/relationships" xmlns:m="http://schemas.openxmlformats.org/officeDocument/2006/math" xmlns:v="urn:schemas-microsoft-com:vml" xmlns:wp14="http://schemas.microsoft.com/office/word/2010/wordprocessingDrawing" xmlns:wp="http://schemas.openxmlformats.org/drawingml/2006/wordprocessingDrawing" xmlns:w10="urn:schemas-microsoft-com:office:word" xmlns:w="http://schemas.openxmlformats.org/wordprocessingml/2006/main" xmlns:w14="http://schemas.microsoft.com/office/word/2010/wordml" xmlns:w15="http://schemas.microsoft.com/office/word/2012/wordml" xmlns:w16cex="http://schemas.microsoft.com/office/word/2018/wordml/cex" xmlns:w16cid="http://schemas.microsoft.com/office/word/2016/wordml/cid" xmlns:w16="http://schemas.microsoft.com/office/word/2018/wordml" xmlns:w16sdtdh="http://schemas.microsoft.com/office/word/2020/wordml/sdtdatahash" xmlns:w16se="http://schemas.microsoft.com/office/word/2015/wordml/symex" xmlns:wpg="http://schemas.microsoft.com/office/word/2010/wordprocessingGroup" xmlns:wpi="http://schemas.microsoft.com/office/word/2010/wordprocessingInk" xmlns:wne="http://schemas.microsoft.com/office/word/2006/wordml" xmlns:wps="http://schemas.microsoft.com/office/word/2010/wordprocessingShape" mc:Ignorable="w14 w15 w16se w16cid w16 w16cex w16sdtdh wp14">
   <w:abstractNum w:abstractNumId="0" w15:restartNumberingAfterBreak="0">
     <w:nsid w:val="0B625F19"/>
     <w:multiLevelType w:val="hybridMultilevel"/>
@@ -3112,7 +4557,7 @@
 </file>
 
 <file path=word/styles.xml><?xml version="1.0" encoding="utf-8"?>
-<w:styles xmlns:mc="http://schemas.openxmlformats.org/markup-compatibility/2006" xmlns:r="http://schemas.openxmlformats.org/officeDocument/2006/relationships" xmlns:w="http://schemas.openxmlformats.org/wordprocessingml/2006/main" xmlns:w14="http://schemas.microsoft.com/office/word/2010/wordml" xmlns:w15="http://schemas.microsoft.com/office/word/2012/wordml" xmlns:w16se="http://schemas.microsoft.com/office/word/2015/wordml/symex" mc:Ignorable="w14 w15 w16se">
+<w:styles xmlns:mc="http://schemas.openxmlformats.org/markup-compatibility/2006" xmlns:r="http://schemas.openxmlformats.org/officeDocument/2006/relationships" xmlns:w="http://schemas.openxmlformats.org/wordprocessingml/2006/main" xmlns:w14="http://schemas.microsoft.com/office/word/2010/wordml" xmlns:w15="http://schemas.microsoft.com/office/word/2012/wordml" xmlns:w16cex="http://schemas.microsoft.com/office/word/2018/wordml/cex" xmlns:w16cid="http://schemas.microsoft.com/office/word/2016/wordml/cid" xmlns:w16="http://schemas.microsoft.com/office/word/2018/wordml" xmlns:w16sdtdh="http://schemas.microsoft.com/office/word/2020/wordml/sdtdatahash" xmlns:w16se="http://schemas.microsoft.com/office/word/2015/wordml/symex" mc:Ignorable="w14 w15 w16se w16cid w16 w16cex w16sdtdh">
   <w:docDefaults>
     <w:rPrDefault>
       <w:rPr>
@@ -3123,7 +4568,7 @@
     </w:rPrDefault>
     <w:pPrDefault/>
   </w:docDefaults>
-  <w:latentStyles w:defLockedState="0" w:defUIPriority="99" w:defSemiHidden="0" w:defUnhideWhenUsed="0" w:defQFormat="0" w:count="371">
+  <w:latentStyles w:defLockedState="0" w:defUIPriority="99" w:defSemiHidden="0" w:defUnhideWhenUsed="0" w:defQFormat="0" w:count="376">
     <w:lsdException w:name="Normal" w:uiPriority="0" w:qFormat="1"/>
     <w:lsdException w:name="heading 1" w:uiPriority="9" w:qFormat="1"/>
     <w:lsdException w:name="heading 2" w:semiHidden="1" w:uiPriority="9" w:unhideWhenUsed="1" w:qFormat="1"/>
@@ -3229,7 +4674,6 @@
     <w:lsdException w:name="HTML Sample" w:semiHidden="1" w:unhideWhenUsed="1"/>
     <w:lsdException w:name="HTML Typewriter" w:semiHidden="1" w:unhideWhenUsed="1"/>
     <w:lsdException w:name="HTML Variable" w:semiHidden="1" w:unhideWhenUsed="1"/>
-    <w:lsdException w:name="Normal Table" w:semiHidden="1" w:unhideWhenUsed="1"/>
     <w:lsdException w:name="annotation subject" w:semiHidden="1" w:unhideWhenUsed="1"/>
     <w:lsdException w:name="No List" w:semiHidden="1" w:unhideWhenUsed="1"/>
     <w:lsdException w:name="Outline List 1" w:semiHidden="1" w:unhideWhenUsed="1"/>
@@ -3272,11 +4716,8 @@
     <w:lsdException w:name="Table Contemporary" w:semiHidden="1" w:unhideWhenUsed="1"/>
     <w:lsdException w:name="Table Elegant" w:semiHidden="1" w:unhideWhenUsed="1"/>
     <w:lsdException w:name="Table Professional" w:semiHidden="1" w:unhideWhenUsed="1"/>
-    <w:lsdException w:name="Table Subtle 1" w:semiHidden="1" w:unhideWhenUsed="1"/>
     <w:lsdException w:name="Table Subtle 2" w:semiHidden="1" w:unhideWhenUsed="1"/>
     <w:lsdException w:name="Table Web 1" w:semiHidden="1" w:unhideWhenUsed="1"/>
-    <w:lsdException w:name="Table Web 2" w:semiHidden="1" w:unhideWhenUsed="1"/>
-    <w:lsdException w:name="Table Web 3" w:semiHidden="1" w:unhideWhenUsed="1"/>
     <w:lsdException w:name="Balloon Text" w:semiHidden="1" w:unhideWhenUsed="1"/>
     <w:lsdException w:name="Table Grid" w:uiPriority="39"/>
     <w:lsdException w:name="Table Theme" w:semiHidden="1" w:unhideWhenUsed="1"/>
@@ -3495,6 +4936,11 @@
     <w:lsdException w:name="List Table 5 Dark Accent 6" w:uiPriority="50"/>
     <w:lsdException w:name="List Table 6 Colorful Accent 6" w:uiPriority="51"/>
     <w:lsdException w:name="List Table 7 Colorful Accent 6" w:uiPriority="52"/>
+    <w:lsdException w:name="Mention" w:semiHidden="1" w:unhideWhenUsed="1"/>
+    <w:lsdException w:name="Smart Hyperlink" w:semiHidden="1" w:unhideWhenUsed="1"/>
+    <w:lsdException w:name="Hashtag" w:semiHidden="1" w:unhideWhenUsed="1"/>
+    <w:lsdException w:name="Unresolved Mention" w:semiHidden="1" w:unhideWhenUsed="1"/>
+    <w:lsdException w:name="Smart Link" w:semiHidden="1" w:unhideWhenUsed="1"/>
   </w:latentStyles>
   <w:style w:type="paragraph" w:default="1" w:styleId="a">
     <w:name w:val="Normal"/>
@@ -3816,6 +5262,48 @@
       <w:szCs w:val="32"/>
     </w:rPr>
   </w:style>
+  <w:style w:type="character" w:styleId="ab">
+    <w:name w:val="Strong"/>
+    <w:basedOn w:val="a0"/>
+    <w:uiPriority w:val="22"/>
+    <w:qFormat/>
+    <w:rsid w:val="00CE4802"/>
+    <w:rPr>
+      <w:b/>
+      <w:bCs/>
+    </w:rPr>
+  </w:style>
+  <w:style w:type="paragraph" w:styleId="ac">
+    <w:name w:val="Normal (Web)"/>
+    <w:basedOn w:val="a"/>
+    <w:uiPriority w:val="99"/>
+    <w:semiHidden/>
+    <w:unhideWhenUsed/>
+    <w:rsid w:val="00D404B8"/>
+    <w:pPr>
+      <w:widowControl/>
+      <w:spacing w:before="100" w:beforeAutospacing="1" w:after="100" w:afterAutospacing="1"/>
+      <w:jc w:val="left"/>
+    </w:pPr>
+    <w:rPr>
+      <w:rFonts w:ascii="宋体" w:eastAsia="宋体" w:hAnsi="宋体" w:cs="宋体"/>
+      <w:sz w:val="24"/>
+      <w:szCs w:val="24"/>
+    </w:rPr>
+  </w:style>
+  <w:style w:type="character" w:styleId="HTML">
+    <w:name w:val="HTML Code"/>
+    <w:basedOn w:val="a0"/>
+    <w:uiPriority w:val="99"/>
+    <w:semiHidden/>
+    <w:unhideWhenUsed/>
+    <w:rsid w:val="00D404B8"/>
+    <w:rPr>
+      <w:rFonts w:ascii="宋体" w:eastAsia="宋体" w:hAnsi="宋体" w:cs="宋体"/>
+      <w:sz w:val="24"/>
+      <w:szCs w:val="24"/>
+    </w:rPr>
+  </w:style>
 </w:styles>
 </file>
 

</xml_diff>